<commit_message>
heavy edits to the page
</commit_message>
<xml_diff>
--- a/syllabus.docx
+++ b/syllabus.docx
@@ -629,7 +629,21 @@
           <w:rFonts w:eastAsia="Garamond"/>
           <w:b/>
         </w:rPr>
-        <w:t xml:space="preserve"> (required):</w:t>
+        <w:t xml:space="preserve"> (</w:t>
+      </w:r>
+      <w:r>
+        <w:rPr>
+          <w:rFonts w:eastAsia="Garamond"/>
+          <w:b/>
+        </w:rPr>
+        <w:t>optional)</w:t>
+      </w:r>
+      <w:r>
+        <w:rPr>
+          <w:rFonts w:eastAsia="Garamond"/>
+          <w:b/>
+        </w:rPr>
+        <w:t>:</w:t>
       </w:r>
       <w:r>
         <w:rPr>
@@ -787,10 +801,7 @@
         </w:rPr>
       </w:pPr>
       <w:r>
-        <w:t>Microsoft Excel. We will be using Excel extensively in this course.</w:t>
-      </w:r>
-      <w:r>
-        <w:t xml:space="preserve"> </w:t>
+        <w:t xml:space="preserve">Microsoft Excel. </w:t>
       </w:r>
     </w:p>
     <w:p>
@@ -1167,6 +1178,13 @@
         <w:pStyle w:val="NoSpacing"/>
       </w:pPr>
       <w:r>
+        <w:rPr>
+          <w:b/>
+          <w:bCs/>
+        </w:rPr>
+        <w:t xml:space="preserve">Catalog Description: </w:t>
+      </w:r>
+      <w:r>
         <w:t>A study of global financial markets and operations of multinational firms. Topics include foreign exchange markets, balance of payments, international investment and banking, monetary and fiscal policy in an open economy, economic integration and monetary unification, and the international monetary system.</w:t>
       </w:r>
     </w:p>
@@ -1189,20 +1207,26 @@
         <w:rPr>
           <w:rFonts w:eastAsia="Batang"/>
         </w:rPr>
-        <w:t>is the sole finance course in the busi</w:t>
+        <w:t xml:space="preserve">is the </w:t>
       </w:r>
       <w:r>
         <w:rPr>
           <w:rFonts w:eastAsia="Batang"/>
         </w:rPr>
-        <w:softHyphen/>
-        <w:t xml:space="preserve">ness core. It emphasizes the creation of value in the corporation through the firm’s investing and financing decisions. In pursuing the overall theme of wealth creation, we address the environment in which financial decisions are made; learn the appropriate decision-making techniques and the logic behind those techniques; and become familiar with some of the terminology of modern finance. </w:t>
-      </w:r>
-    </w:p>
-    <w:p>
-      <w:pPr>
-        <w:pStyle w:val="NoSpacing"/>
-      </w:pPr>
+        <w:t>only prerequisite for this course</w:t>
+      </w:r>
+      <w:r>
+        <w:rPr>
+          <w:rFonts w:eastAsia="Batang"/>
+        </w:rPr>
+        <w:t>.</w:t>
+      </w:r>
+      <w:r>
+        <w:rPr>
+          <w:rFonts w:eastAsia="Batang"/>
+        </w:rPr>
+        <w:t xml:space="preserve"> This course, while an upper-level finance course, is at the same time an economics and international relations course. We will be looking at finance broadly, not just the calculations, but the decisions and the incentives behind the decisions that determine international finance.</w:t>
+      </w:r>
     </w:p>
     <w:p>
       <w:pPr>
@@ -1285,6 +1309,13 @@
         </w:rPr>
         <w:t>:</w:t>
       </w:r>
+      <w:r>
+        <w:rPr>
+          <w:rFonts w:eastAsia="Garamond"/>
+          <w:color w:val="000000"/>
+        </w:rPr>
+        <w:t xml:space="preserve"> Global Financial Environment</w:t>
+      </w:r>
     </w:p>
     <w:p>
       <w:pPr>
@@ -1313,7 +1344,7 @@
           <w:rFonts w:eastAsia="Garamond"/>
           <w:color w:val="000000"/>
         </w:rPr>
-        <w:t>Introduction to Financial Management</w:t>
+        <w:t>Multinational Financial Management: Opportunities and Challenges</w:t>
       </w:r>
     </w:p>
     <w:p>
@@ -1343,7 +1374,7 @@
           <w:rFonts w:eastAsia="Garamond"/>
           <w:color w:val="000000"/>
         </w:rPr>
-        <w:t>Financial Statements, Taxes, and Cash Flow</w:t>
+        <w:t>International Monetary System</w:t>
       </w:r>
     </w:p>
     <w:p>
@@ -1373,7 +1404,7 @@
           <w:rFonts w:eastAsia="Garamond"/>
           <w:color w:val="000000"/>
         </w:rPr>
-        <w:t>Working with Financial Statements</w:t>
+        <w:t>The Balance of Payments</w:t>
       </w:r>
     </w:p>
     <w:p>
@@ -1389,6 +1420,57 @@
         <w:rPr>
           <w:rFonts w:eastAsia="Garamond"/>
           <w:color w:val="000000"/>
+        </w:rPr>
+      </w:pPr>
+      <w:r>
+        <w:rPr>
+          <w:rFonts w:eastAsia="Garamond"/>
+          <w:color w:val="000000"/>
+        </w:rPr>
+        <w:t>*</w:t>
+      </w:r>
+      <w:r>
+        <w:rPr>
+          <w:rFonts w:eastAsia="Garamond"/>
+          <w:color w:val="000000"/>
+        </w:rPr>
+        <w:t>Chapter 4. Corporate Governance</w:t>
+      </w:r>
+      <w:r>
+        <w:rPr>
+          <w:rFonts w:eastAsia="Garamond"/>
+          <w:color w:val="000000"/>
+        </w:rPr>
+        <w:t xml:space="preserve"> (review</w:t>
+      </w:r>
+      <w:r>
+        <w:rPr>
+          <w:rFonts w:eastAsia="Garamond"/>
+          <w:color w:val="000000"/>
+        </w:rPr>
+        <w:t xml:space="preserve"> – covered in Man. </w:t>
+      </w:r>
+      <w:r>
+        <w:rPr>
+          <w:rFonts w:eastAsia="Garamond"/>
+          <w:color w:val="000000"/>
+        </w:rPr>
+        <w:t>Fin.) *</w:t>
+      </w:r>
+    </w:p>
+    <w:p>
+      <w:pPr>
+        <w:pBdr>
+          <w:top w:val="nil"/>
+          <w:left w:val="nil"/>
+          <w:bottom w:val="nil"/>
+          <w:right w:val="nil"/>
+          <w:between w:val="nil"/>
+        </w:pBdr>
+        <w:ind w:left="1440"/>
+        <w:rPr>
+          <w:rFonts w:eastAsia="Garamond"/>
+          <w:color w:val="000000"/>
           <w:sz w:val="16"/>
         </w:rPr>
       </w:pPr>
@@ -1472,6 +1554,13 @@
         </w:rPr>
         <w:t>:</w:t>
       </w:r>
+      <w:r>
+        <w:rPr>
+          <w:rFonts w:eastAsia="Garamond"/>
+          <w:color w:val="000000"/>
+        </w:rPr>
+        <w:t xml:space="preserve"> Foreign Exchange Theory and Markets</w:t>
+      </w:r>
     </w:p>
     <w:p>
       <w:pPr>
@@ -1500,626 +1589,914 @@
           <w:rFonts w:eastAsia="Garamond"/>
           <w:color w:val="000000"/>
         </w:rPr>
+        <w:t>5</w:t>
+      </w:r>
+      <w:r>
+        <w:rPr>
+          <w:rFonts w:eastAsia="Garamond"/>
+          <w:color w:val="000000"/>
+        </w:rPr>
+        <w:t xml:space="preserve">. </w:t>
+      </w:r>
+      <w:r>
+        <w:rPr>
+          <w:rFonts w:eastAsia="Garamond"/>
+          <w:color w:val="000000"/>
+        </w:rPr>
+        <w:t>The Foreign Exchange Market</w:t>
+      </w:r>
+    </w:p>
+    <w:p>
+      <w:pPr>
+        <w:pBdr>
+          <w:top w:val="nil"/>
+          <w:left w:val="nil"/>
+          <w:bottom w:val="nil"/>
+          <w:right w:val="nil"/>
+          <w:between w:val="nil"/>
+        </w:pBdr>
+        <w:ind w:left="1440"/>
+        <w:rPr>
+          <w:rFonts w:eastAsia="Garamond"/>
+          <w:color w:val="000000"/>
+        </w:rPr>
+      </w:pPr>
+      <w:r>
+        <w:rPr>
+          <w:rFonts w:eastAsia="Garamond"/>
+          <w:color w:val="000000"/>
+        </w:rPr>
+        <w:t xml:space="preserve">Chapter </w:t>
+      </w:r>
+      <w:r>
+        <w:rPr>
+          <w:rFonts w:eastAsia="Garamond"/>
+          <w:color w:val="000000"/>
+        </w:rPr>
+        <w:t>6</w:t>
+      </w:r>
+      <w:r>
+        <w:rPr>
+          <w:rFonts w:eastAsia="Garamond"/>
+          <w:color w:val="00000A"/>
+        </w:rPr>
+        <w:t xml:space="preserve">. </w:t>
+      </w:r>
+      <w:r>
+        <w:rPr>
+          <w:rFonts w:eastAsia="Garamond"/>
+          <w:color w:val="00000A"/>
+        </w:rPr>
+        <w:t>International Parity Conditions</w:t>
+      </w:r>
+    </w:p>
+    <w:p>
+      <w:pPr>
+        <w:pBdr>
+          <w:top w:val="nil"/>
+          <w:left w:val="nil"/>
+          <w:bottom w:val="nil"/>
+          <w:right w:val="nil"/>
+          <w:between w:val="nil"/>
+        </w:pBdr>
+        <w:ind w:left="1440"/>
+        <w:rPr>
+          <w:rFonts w:eastAsia="Garamond"/>
+          <w:color w:val="000000"/>
+        </w:rPr>
+      </w:pPr>
+      <w:r>
+        <w:rPr>
+          <w:rFonts w:eastAsia="Garamond"/>
+          <w:color w:val="000000"/>
+        </w:rPr>
+        <w:t>*</w:t>
+      </w:r>
+      <w:r>
+        <w:rPr>
+          <w:rFonts w:eastAsia="Garamond"/>
+          <w:color w:val="000000"/>
+        </w:rPr>
+        <w:t xml:space="preserve">Chapter 7. </w:t>
+      </w:r>
+      <w:r>
+        <w:rPr>
+          <w:rFonts w:eastAsia="Garamond"/>
+          <w:color w:val="000000"/>
+        </w:rPr>
+        <w:t>Foreign Currency Derivatives: Futures and Options</w:t>
+      </w:r>
+      <w:r>
+        <w:rPr>
+          <w:rFonts w:eastAsia="Garamond"/>
+          <w:color w:val="000000"/>
+        </w:rPr>
+        <w:t>*</w:t>
+      </w:r>
+    </w:p>
+    <w:p>
+      <w:pPr>
+        <w:pBdr>
+          <w:top w:val="nil"/>
+          <w:left w:val="nil"/>
+          <w:bottom w:val="nil"/>
+          <w:right w:val="nil"/>
+          <w:between w:val="nil"/>
+        </w:pBdr>
+        <w:ind w:left="1440"/>
+        <w:rPr>
+          <w:rFonts w:eastAsia="Garamond"/>
+          <w:color w:val="000000"/>
+        </w:rPr>
+      </w:pPr>
+      <w:r>
+        <w:rPr>
+          <w:rFonts w:eastAsia="Garamond"/>
+          <w:color w:val="000000"/>
+        </w:rPr>
+        <w:t xml:space="preserve">Chapter 8. </w:t>
+      </w:r>
+      <w:r>
+        <w:rPr>
+          <w:rFonts w:eastAsia="Garamond"/>
+          <w:color w:val="000000"/>
+        </w:rPr>
+        <w:t>Interest Rate Risk and Swaps</w:t>
+      </w:r>
+    </w:p>
+    <w:p>
+      <w:pPr>
+        <w:pBdr>
+          <w:top w:val="nil"/>
+          <w:left w:val="nil"/>
+          <w:bottom w:val="nil"/>
+          <w:right w:val="nil"/>
+          <w:between w:val="nil"/>
+        </w:pBdr>
+        <w:ind w:left="1440"/>
+        <w:rPr>
+          <w:rFonts w:eastAsia="Garamond"/>
+          <w:color w:val="000000"/>
+        </w:rPr>
+      </w:pPr>
+      <w:r>
+        <w:rPr>
+          <w:rFonts w:eastAsia="Garamond"/>
+          <w:color w:val="000000"/>
+        </w:rPr>
+        <w:t xml:space="preserve">Chapter 9. </w:t>
+      </w:r>
+      <w:r>
+        <w:rPr>
+          <w:rFonts w:eastAsia="Garamond"/>
+          <w:color w:val="000000"/>
+        </w:rPr>
+        <w:t>Foreign Exchange Rate Determination and Intervention</w:t>
+      </w:r>
+    </w:p>
+    <w:p>
+      <w:pPr>
+        <w:pBdr>
+          <w:top w:val="nil"/>
+          <w:left w:val="nil"/>
+          <w:bottom w:val="nil"/>
+          <w:right w:val="nil"/>
+          <w:between w:val="nil"/>
+        </w:pBdr>
+        <w:ind w:left="1440"/>
+        <w:rPr>
+          <w:rFonts w:eastAsia="Garamond"/>
+          <w:color w:val="000000"/>
+        </w:rPr>
+      </w:pPr>
+    </w:p>
+    <w:p>
+      <w:pPr>
+        <w:pBdr>
+          <w:top w:val="nil"/>
+          <w:left w:val="nil"/>
+          <w:bottom w:val="nil"/>
+          <w:right w:val="nil"/>
+          <w:between w:val="nil"/>
+        </w:pBdr>
+        <w:ind w:left="1440"/>
+        <w:rPr>
+          <w:rFonts w:eastAsia="Garamond"/>
+          <w:color w:val="000000"/>
+        </w:rPr>
+      </w:pPr>
+      <w:r>
+        <w:rPr>
+          <w:rFonts w:eastAsia="Garamond"/>
+          <w:color w:val="000000"/>
+        </w:rPr>
+        <w:t>Exam 2</w:t>
+      </w:r>
+      <w:r>
+        <w:rPr>
+          <w:rFonts w:eastAsia="Garamond"/>
+          <w:color w:val="000000"/>
+        </w:rPr>
+        <w:t xml:space="preserve"> (Midterm)</w:t>
+      </w:r>
+    </w:p>
+    <w:p>
+      <w:pPr>
+        <w:pBdr>
+          <w:top w:val="nil"/>
+          <w:left w:val="nil"/>
+          <w:bottom w:val="nil"/>
+          <w:right w:val="nil"/>
+          <w:between w:val="nil"/>
+        </w:pBdr>
+        <w:ind w:left="1440"/>
+        <w:rPr>
+          <w:rFonts w:eastAsia="Garamond"/>
+          <w:color w:val="000000"/>
+        </w:rPr>
+      </w:pPr>
+    </w:p>
+    <w:p>
+      <w:pPr>
+        <w:pBdr>
+          <w:top w:val="nil"/>
+          <w:left w:val="nil"/>
+          <w:bottom w:val="nil"/>
+          <w:right w:val="nil"/>
+          <w:between w:val="nil"/>
+        </w:pBdr>
+        <w:ind w:left="720"/>
+        <w:rPr>
+          <w:rFonts w:eastAsia="Garamond"/>
+          <w:color w:val="000000"/>
+        </w:rPr>
+      </w:pPr>
+      <w:r>
+        <w:rPr>
+          <w:rFonts w:eastAsia="Garamond"/>
+          <w:b/>
+          <w:bCs/>
+          <w:color w:val="000000"/>
+          <w:u w:val="single"/>
+        </w:rPr>
+        <w:t>Module 3</w:t>
+      </w:r>
+      <w:r>
+        <w:rPr>
+          <w:rFonts w:eastAsia="Garamond"/>
+          <w:color w:val="000000"/>
+        </w:rPr>
+        <w:t>:</w:t>
+      </w:r>
+      <w:r>
+        <w:rPr>
+          <w:rFonts w:eastAsia="Garamond"/>
+          <w:color w:val="000000"/>
+        </w:rPr>
+        <w:t xml:space="preserve"> Foreign Exchange Exposure</w:t>
+      </w:r>
+    </w:p>
+    <w:p>
+      <w:pPr>
+        <w:pBdr>
+          <w:top w:val="nil"/>
+          <w:left w:val="nil"/>
+          <w:bottom w:val="nil"/>
+          <w:right w:val="nil"/>
+          <w:between w:val="nil"/>
+        </w:pBdr>
+        <w:ind w:left="1440"/>
+        <w:rPr>
+          <w:rFonts w:eastAsia="Garamond"/>
+          <w:color w:val="000000"/>
+        </w:rPr>
+      </w:pPr>
+      <w:r>
+        <w:rPr>
+          <w:rFonts w:eastAsia="Garamond"/>
+          <w:color w:val="000000"/>
+        </w:rPr>
+        <w:t xml:space="preserve">Chapter 10. </w:t>
+      </w:r>
+      <w:r>
+        <w:rPr>
+          <w:rFonts w:eastAsia="Garamond"/>
+          <w:color w:val="000000"/>
+        </w:rPr>
+        <w:t>Transaction Exposure</w:t>
+      </w:r>
+    </w:p>
+    <w:p>
+      <w:pPr>
+        <w:pBdr>
+          <w:top w:val="nil"/>
+          <w:left w:val="nil"/>
+          <w:bottom w:val="nil"/>
+          <w:right w:val="nil"/>
+          <w:between w:val="nil"/>
+        </w:pBdr>
+        <w:ind w:left="1440"/>
+        <w:rPr>
+          <w:rFonts w:eastAsia="Garamond"/>
+          <w:color w:val="000000"/>
+        </w:rPr>
+      </w:pPr>
+      <w:r>
+        <w:rPr>
+          <w:rFonts w:eastAsia="Garamond"/>
+          <w:color w:val="000000"/>
+        </w:rPr>
+        <w:t xml:space="preserve">Chapter 11. </w:t>
+      </w:r>
+      <w:r>
+        <w:rPr>
+          <w:rFonts w:eastAsia="Garamond"/>
+          <w:color w:val="000000"/>
+        </w:rPr>
+        <w:t>Translation Exposure</w:t>
+      </w:r>
+    </w:p>
+    <w:p>
+      <w:pPr>
+        <w:pBdr>
+          <w:top w:val="nil"/>
+          <w:left w:val="nil"/>
+          <w:bottom w:val="nil"/>
+          <w:right w:val="nil"/>
+          <w:between w:val="nil"/>
+        </w:pBdr>
+        <w:ind w:left="1440"/>
+        <w:rPr>
+          <w:rFonts w:eastAsia="Garamond"/>
+          <w:color w:val="000000"/>
+        </w:rPr>
+      </w:pPr>
+      <w:r>
+        <w:rPr>
+          <w:rFonts w:eastAsia="Garamond"/>
+          <w:color w:val="000000"/>
+        </w:rPr>
+        <w:t xml:space="preserve">Chapter 12. </w:t>
+      </w:r>
+      <w:r>
+        <w:rPr>
+          <w:rFonts w:eastAsia="Garamond"/>
+          <w:color w:val="000000"/>
+        </w:rPr>
+        <w:t>Operating Exposure</w:t>
+      </w:r>
+    </w:p>
+    <w:p>
+      <w:pPr>
+        <w:pBdr>
+          <w:top w:val="nil"/>
+          <w:left w:val="nil"/>
+          <w:bottom w:val="nil"/>
+          <w:right w:val="nil"/>
+          <w:between w:val="nil"/>
+        </w:pBdr>
+        <w:ind w:left="1440"/>
+        <w:rPr>
+          <w:rFonts w:eastAsia="Garamond"/>
+          <w:color w:val="000000"/>
+        </w:rPr>
+      </w:pPr>
+    </w:p>
+    <w:p>
+      <w:pPr>
+        <w:pBdr>
+          <w:top w:val="nil"/>
+          <w:left w:val="nil"/>
+          <w:bottom w:val="nil"/>
+          <w:right w:val="nil"/>
+          <w:between w:val="nil"/>
+        </w:pBdr>
+        <w:ind w:left="1440"/>
+        <w:rPr>
+          <w:rFonts w:eastAsia="Garamond"/>
+          <w:color w:val="000000"/>
+        </w:rPr>
+      </w:pPr>
+      <w:r>
+        <w:rPr>
+          <w:rFonts w:eastAsia="Garamond"/>
+          <w:color w:val="000000"/>
+        </w:rPr>
+        <w:t>Exam 3</w:t>
+      </w:r>
+      <w:r>
+        <w:rPr>
+          <w:rFonts w:eastAsia="Garamond"/>
+          <w:color w:val="000000"/>
+        </w:rPr>
+        <w:t xml:space="preserve"> (about week 10)</w:t>
+      </w:r>
+    </w:p>
+    <w:p>
+      <w:pPr>
+        <w:pBdr>
+          <w:top w:val="nil"/>
+          <w:left w:val="nil"/>
+          <w:bottom w:val="nil"/>
+          <w:right w:val="nil"/>
+          <w:between w:val="nil"/>
+        </w:pBdr>
+        <w:ind w:left="1440"/>
+        <w:rPr>
+          <w:rFonts w:eastAsia="Garamond"/>
+          <w:color w:val="000000"/>
+        </w:rPr>
+      </w:pPr>
+    </w:p>
+    <w:p>
+      <w:pPr>
+        <w:pBdr>
+          <w:top w:val="nil"/>
+          <w:left w:val="nil"/>
+          <w:bottom w:val="nil"/>
+          <w:right w:val="nil"/>
+          <w:between w:val="nil"/>
+        </w:pBdr>
+        <w:ind w:left="720"/>
+        <w:rPr>
+          <w:rFonts w:eastAsia="Garamond"/>
+          <w:color w:val="000000"/>
+        </w:rPr>
+      </w:pPr>
+      <w:r>
+        <w:rPr>
+          <w:rFonts w:eastAsia="Garamond"/>
+          <w:b/>
+          <w:bCs/>
+          <w:color w:val="000000"/>
+          <w:u w:val="single"/>
+        </w:rPr>
+        <w:t>Module 4</w:t>
+      </w:r>
+      <w:r>
+        <w:rPr>
+          <w:rFonts w:eastAsia="Garamond"/>
+          <w:color w:val="000000"/>
+        </w:rPr>
+        <w:t>:</w:t>
+      </w:r>
+      <w:r>
+        <w:rPr>
+          <w:rFonts w:eastAsia="Garamond"/>
+          <w:color w:val="000000"/>
+        </w:rPr>
+        <w:t xml:space="preserve"> Financing the Global Firm</w:t>
+      </w:r>
+    </w:p>
+    <w:p>
+      <w:pPr>
+        <w:pBdr>
+          <w:top w:val="nil"/>
+          <w:left w:val="nil"/>
+          <w:bottom w:val="nil"/>
+          <w:right w:val="nil"/>
+          <w:between w:val="nil"/>
+        </w:pBdr>
+        <w:ind w:left="1440"/>
+        <w:rPr>
+          <w:rFonts w:eastAsia="Garamond"/>
+          <w:color w:val="000000"/>
+        </w:rPr>
+      </w:pPr>
+      <w:r>
+        <w:rPr>
+          <w:rFonts w:eastAsia="Garamond"/>
+          <w:color w:val="000000"/>
+        </w:rPr>
+        <w:t xml:space="preserve">Chapter </w:t>
+      </w:r>
+      <w:r>
+        <w:rPr>
+          <w:rFonts w:eastAsia="Garamond"/>
+          <w:color w:val="000000"/>
+        </w:rPr>
+        <w:t>13</w:t>
+      </w:r>
+      <w:r>
+        <w:rPr>
+          <w:rFonts w:eastAsia="Garamond"/>
+          <w:color w:val="000000"/>
+        </w:rPr>
+        <w:t xml:space="preserve">. </w:t>
+      </w:r>
+      <w:r>
+        <w:rPr>
+          <w:rFonts w:eastAsia="Garamond"/>
+          <w:color w:val="000000"/>
+        </w:rPr>
+        <w:t>Global Cost and Availability of Capital</w:t>
+      </w:r>
+    </w:p>
+    <w:p>
+      <w:pPr>
+        <w:pBdr>
+          <w:top w:val="nil"/>
+          <w:left w:val="nil"/>
+          <w:bottom w:val="nil"/>
+          <w:right w:val="nil"/>
+          <w:between w:val="nil"/>
+        </w:pBdr>
+        <w:ind w:left="1440"/>
+        <w:rPr>
+          <w:rFonts w:eastAsia="Garamond"/>
+          <w:color w:val="000000"/>
+        </w:rPr>
+      </w:pPr>
+      <w:r>
+        <w:rPr>
+          <w:rFonts w:eastAsia="Garamond"/>
+          <w:color w:val="000000"/>
+        </w:rPr>
+        <w:t xml:space="preserve">Chapter </w:t>
+      </w:r>
+      <w:r>
+        <w:rPr>
+          <w:rFonts w:eastAsia="Garamond"/>
+          <w:color w:val="000000"/>
+        </w:rPr>
+        <w:t>14</w:t>
+      </w:r>
+      <w:r>
+        <w:rPr>
+          <w:rFonts w:eastAsia="Garamond"/>
+          <w:color w:val="000000"/>
+        </w:rPr>
+        <w:t>.</w:t>
+      </w:r>
+      <w:r>
+        <w:rPr>
+          <w:rFonts w:eastAsia="Garamond"/>
+          <w:color w:val="000000"/>
+        </w:rPr>
+        <w:t xml:space="preserve"> Funding the Multinational Firm</w:t>
+      </w:r>
+    </w:p>
+    <w:p>
+      <w:pPr>
+        <w:pBdr>
+          <w:top w:val="nil"/>
+          <w:left w:val="nil"/>
+          <w:bottom w:val="nil"/>
+          <w:right w:val="nil"/>
+          <w:between w:val="nil"/>
+        </w:pBdr>
+        <w:ind w:left="1440"/>
+        <w:rPr>
+          <w:rFonts w:eastAsia="Garamond"/>
+          <w:color w:val="000000"/>
+        </w:rPr>
+      </w:pPr>
+      <w:r>
+        <w:rPr>
+          <w:rFonts w:eastAsia="Garamond"/>
+          <w:color w:val="000000"/>
+        </w:rPr>
+        <w:t>Chapter 1</w:t>
+      </w:r>
+      <w:r>
+        <w:rPr>
+          <w:rFonts w:eastAsia="Garamond"/>
+          <w:color w:val="000000"/>
+        </w:rPr>
+        <w:t>5</w:t>
+      </w:r>
+      <w:r>
+        <w:rPr>
+          <w:rFonts w:eastAsia="Garamond"/>
+          <w:color w:val="000000"/>
+        </w:rPr>
+        <w:t xml:space="preserve">. </w:t>
+      </w:r>
+      <w:r>
+        <w:rPr>
+          <w:rFonts w:eastAsia="Garamond"/>
+          <w:color w:val="000000"/>
+        </w:rPr>
+        <w:t>Multinational Tax Management</w:t>
+      </w:r>
+    </w:p>
+    <w:p>
+      <w:pPr>
+        <w:pBdr>
+          <w:top w:val="nil"/>
+          <w:left w:val="nil"/>
+          <w:bottom w:val="nil"/>
+          <w:right w:val="nil"/>
+          <w:between w:val="nil"/>
+        </w:pBdr>
+        <w:ind w:left="1440"/>
+        <w:rPr>
+          <w:rFonts w:eastAsia="Garamond"/>
+          <w:color w:val="000000"/>
+        </w:rPr>
+      </w:pPr>
+      <w:r>
+        <w:rPr>
+          <w:rFonts w:eastAsia="Garamond"/>
+          <w:color w:val="000000"/>
+        </w:rPr>
+        <w:t>Chapter 1</w:t>
+      </w:r>
+      <w:r>
+        <w:rPr>
+          <w:rFonts w:eastAsia="Garamond"/>
+          <w:color w:val="000000"/>
+        </w:rPr>
+        <w:t>6. International Trade Finance</w:t>
+      </w:r>
+    </w:p>
+    <w:p>
+      <w:pPr>
+        <w:pBdr>
+          <w:top w:val="nil"/>
+          <w:left w:val="nil"/>
+          <w:bottom w:val="nil"/>
+          <w:right w:val="nil"/>
+          <w:between w:val="nil"/>
+        </w:pBdr>
+        <w:ind w:left="1440"/>
+        <w:rPr>
+          <w:rFonts w:eastAsia="Garamond"/>
+          <w:color w:val="000000"/>
+        </w:rPr>
+      </w:pPr>
+    </w:p>
+    <w:p>
+      <w:pPr>
+        <w:pBdr>
+          <w:top w:val="nil"/>
+          <w:left w:val="nil"/>
+          <w:bottom w:val="nil"/>
+          <w:right w:val="nil"/>
+          <w:between w:val="nil"/>
+        </w:pBdr>
+        <w:ind w:firstLine="720"/>
+        <w:rPr>
+          <w:rFonts w:eastAsia="Garamond"/>
+          <w:color w:val="000000"/>
+        </w:rPr>
+      </w:pPr>
+      <w:r>
+        <w:rPr>
+          <w:rFonts w:eastAsia="Garamond"/>
+          <w:b/>
+          <w:bCs/>
+          <w:color w:val="000000"/>
+        </w:rPr>
+        <w:t>Module 5:</w:t>
+      </w:r>
+      <w:r>
+        <w:rPr>
+          <w:rFonts w:eastAsia="Garamond"/>
+          <w:b/>
+          <w:bCs/>
+          <w:color w:val="000000"/>
+        </w:rPr>
+        <w:t xml:space="preserve"> </w:t>
+      </w:r>
+      <w:r>
+        <w:rPr>
+          <w:rFonts w:eastAsia="Garamond"/>
+          <w:color w:val="000000"/>
+        </w:rPr>
+        <w:t>Foreign Investments and Investment Analysis</w:t>
+      </w:r>
+    </w:p>
+    <w:p>
+      <w:pPr>
+        <w:pBdr>
+          <w:top w:val="nil"/>
+          <w:left w:val="nil"/>
+          <w:bottom w:val="nil"/>
+          <w:right w:val="nil"/>
+          <w:between w:val="nil"/>
+        </w:pBdr>
+        <w:ind w:left="1440"/>
+        <w:rPr>
+          <w:rFonts w:eastAsia="Garamond"/>
+          <w:color w:val="000000"/>
+        </w:rPr>
+      </w:pPr>
+      <w:r>
+        <w:rPr>
+          <w:rFonts w:eastAsia="Garamond"/>
+          <w:color w:val="000000"/>
+        </w:rPr>
+        <w:t>Chapter 1</w:t>
+      </w:r>
+      <w:r>
+        <w:rPr>
+          <w:rFonts w:eastAsia="Garamond"/>
+          <w:color w:val="000000"/>
+        </w:rPr>
+        <w:t>7. Foreign Direct Investment and Political Risk</w:t>
+      </w:r>
+    </w:p>
+    <w:p>
+      <w:pPr>
+        <w:pBdr>
+          <w:top w:val="nil"/>
+          <w:left w:val="nil"/>
+          <w:bottom w:val="nil"/>
+          <w:right w:val="nil"/>
+          <w:between w:val="nil"/>
+        </w:pBdr>
+        <w:ind w:left="720"/>
+        <w:rPr>
+          <w:rFonts w:eastAsia="Garamond"/>
+          <w:color w:val="000000"/>
+        </w:rPr>
+      </w:pPr>
+    </w:p>
+    <w:p>
+      <w:pPr>
+        <w:pBdr>
+          <w:top w:val="nil"/>
+          <w:left w:val="nil"/>
+          <w:bottom w:val="nil"/>
+          <w:right w:val="nil"/>
+          <w:between w:val="nil"/>
+        </w:pBdr>
+        <w:ind w:left="720"/>
+        <w:rPr>
+          <w:rFonts w:eastAsia="Garamond"/>
+          <w:b/>
+          <w:bCs/>
+          <w:color w:val="000000"/>
+        </w:rPr>
+      </w:pPr>
+      <w:r>
+        <w:rPr>
+          <w:rFonts w:eastAsia="Garamond"/>
+          <w:b/>
+          <w:bCs/>
+          <w:color w:val="000000"/>
+        </w:rPr>
+        <w:t xml:space="preserve">Final Exam, </w:t>
+      </w:r>
+      <w:r>
+        <w:rPr>
+          <w:rFonts w:eastAsia="Garamond"/>
+          <w:b/>
+          <w:bCs/>
+          <w:color w:val="000000"/>
+        </w:rPr>
+        <w:t>Mond</w:t>
+      </w:r>
+      <w:r>
+        <w:rPr>
+          <w:rFonts w:eastAsia="Garamond"/>
+          <w:b/>
+          <w:bCs/>
+          <w:color w:val="000000"/>
+        </w:rPr>
+        <w:t>ay</w:t>
+      </w:r>
+      <w:r>
+        <w:rPr>
+          <w:rFonts w:eastAsia="Garamond"/>
+          <w:b/>
+          <w:bCs/>
+          <w:color w:val="000000"/>
+        </w:rPr>
+        <w:t xml:space="preserve">, </w:t>
+      </w:r>
+      <w:r>
+        <w:rPr>
+          <w:rFonts w:eastAsia="Garamond"/>
+          <w:b/>
+          <w:bCs/>
+          <w:color w:val="000000"/>
+        </w:rPr>
+        <w:t>5</w:t>
+      </w:r>
+      <w:r>
+        <w:rPr>
+          <w:rFonts w:eastAsia="Garamond"/>
+          <w:b/>
+          <w:bCs/>
+          <w:color w:val="000000"/>
+        </w:rPr>
+        <w:t>/</w:t>
+      </w:r>
+      <w:r>
+        <w:rPr>
+          <w:rFonts w:eastAsia="Garamond"/>
+          <w:b/>
+          <w:bCs/>
+          <w:color w:val="000000"/>
+        </w:rPr>
         <w:t>4</w:t>
       </w:r>
       <w:r>
         <w:rPr>
           <w:rFonts w:eastAsia="Garamond"/>
-          <w:color w:val="000000"/>
-        </w:rPr>
-        <w:t xml:space="preserve">. </w:t>
-      </w:r>
-      <w:r>
-        <w:rPr>
-          <w:rFonts w:eastAsia="Garamond"/>
-          <w:color w:val="000000"/>
-        </w:rPr>
-        <w:t>Introduction to Valuation: The Time Value of Money</w:t>
-      </w:r>
-    </w:p>
-    <w:p>
-      <w:pPr>
-        <w:pBdr>
-          <w:top w:val="nil"/>
-          <w:left w:val="nil"/>
-          <w:bottom w:val="nil"/>
-          <w:right w:val="nil"/>
-          <w:between w:val="nil"/>
-        </w:pBdr>
-        <w:ind w:left="1440"/>
-        <w:rPr>
-          <w:rFonts w:eastAsia="Garamond"/>
-          <w:color w:val="000000"/>
-        </w:rPr>
-      </w:pPr>
-      <w:r>
-        <w:rPr>
-          <w:rFonts w:eastAsia="Garamond"/>
-          <w:color w:val="000000"/>
-        </w:rPr>
-        <w:t xml:space="preserve">Chapter </w:t>
-      </w:r>
-      <w:r>
-        <w:rPr>
-          <w:rFonts w:eastAsia="Garamond"/>
-          <w:color w:val="00000A"/>
-        </w:rPr>
-        <w:t>5. Discounted Cash Flow Valuation</w:t>
-      </w:r>
-    </w:p>
-    <w:p>
-      <w:pPr>
-        <w:pBdr>
-          <w:top w:val="nil"/>
-          <w:left w:val="nil"/>
-          <w:bottom w:val="nil"/>
-          <w:right w:val="nil"/>
-          <w:between w:val="nil"/>
-        </w:pBdr>
-        <w:ind w:left="1440"/>
-        <w:rPr>
-          <w:rFonts w:eastAsia="Garamond"/>
-          <w:color w:val="000000"/>
-        </w:rPr>
-      </w:pPr>
-    </w:p>
-    <w:p>
-      <w:pPr>
-        <w:pBdr>
-          <w:top w:val="nil"/>
-          <w:left w:val="nil"/>
-          <w:bottom w:val="nil"/>
-          <w:right w:val="nil"/>
-          <w:between w:val="nil"/>
-        </w:pBdr>
-        <w:ind w:left="1440"/>
-        <w:rPr>
-          <w:rFonts w:eastAsia="Garamond"/>
-          <w:color w:val="000000"/>
-        </w:rPr>
-      </w:pPr>
-      <w:r>
-        <w:rPr>
-          <w:rFonts w:eastAsia="Garamond"/>
-          <w:color w:val="000000"/>
-        </w:rPr>
-        <w:t>Exam 2</w:t>
-      </w:r>
-      <w:r>
-        <w:rPr>
-          <w:rFonts w:eastAsia="Garamond"/>
-          <w:color w:val="000000"/>
-        </w:rPr>
-        <w:t xml:space="preserve"> (Midterm)</w:t>
-      </w:r>
-    </w:p>
-    <w:p>
-      <w:pPr>
-        <w:pBdr>
-          <w:top w:val="nil"/>
-          <w:left w:val="nil"/>
-          <w:bottom w:val="nil"/>
-          <w:right w:val="nil"/>
-          <w:between w:val="nil"/>
-        </w:pBdr>
-        <w:ind w:left="1440"/>
-        <w:rPr>
-          <w:rFonts w:eastAsia="Garamond"/>
-          <w:color w:val="000000"/>
-        </w:rPr>
-      </w:pPr>
-    </w:p>
-    <w:p>
-      <w:pPr>
-        <w:pBdr>
-          <w:top w:val="nil"/>
-          <w:left w:val="nil"/>
-          <w:bottom w:val="nil"/>
-          <w:right w:val="nil"/>
-          <w:between w:val="nil"/>
-        </w:pBdr>
-        <w:ind w:left="720"/>
-        <w:rPr>
-          <w:rFonts w:eastAsia="Garamond"/>
-          <w:color w:val="000000"/>
-        </w:rPr>
-      </w:pPr>
-      <w:r>
-        <w:rPr>
-          <w:rFonts w:eastAsia="Garamond"/>
-          <w:b/>
-          <w:bCs/>
-          <w:color w:val="000000"/>
-          <w:u w:val="single"/>
-        </w:rPr>
-        <w:t>Module 3</w:t>
-      </w:r>
-      <w:r>
-        <w:rPr>
-          <w:rFonts w:eastAsia="Garamond"/>
+          <w:b/>
+          <w:bCs/>
+          <w:color w:val="000000"/>
+        </w:rPr>
+        <w:t>/2</w:t>
+      </w:r>
+      <w:r>
+        <w:rPr>
+          <w:rFonts w:eastAsia="Garamond"/>
+          <w:b/>
+          <w:bCs/>
+          <w:color w:val="000000"/>
+        </w:rPr>
+        <w:t>6</w:t>
+      </w:r>
+      <w:r>
+        <w:rPr>
+          <w:rFonts w:eastAsia="Garamond"/>
+          <w:b/>
+          <w:bCs/>
+          <w:color w:val="000000"/>
+        </w:rPr>
+        <w:t xml:space="preserve"> at </w:t>
+      </w:r>
+      <w:r>
+        <w:rPr>
+          <w:rFonts w:eastAsia="Garamond"/>
+          <w:b/>
+          <w:bCs/>
+          <w:color w:val="000000"/>
+        </w:rPr>
+        <w:t>10</w:t>
+      </w:r>
+      <w:r>
+        <w:rPr>
+          <w:rFonts w:eastAsia="Garamond"/>
+          <w:b/>
+          <w:bCs/>
           <w:color w:val="000000"/>
         </w:rPr>
         <w:t>:</w:t>
       </w:r>
-    </w:p>
-    <w:p>
-      <w:pPr>
-        <w:pBdr>
-          <w:top w:val="nil"/>
-          <w:left w:val="nil"/>
-          <w:bottom w:val="nil"/>
-          <w:right w:val="nil"/>
-          <w:between w:val="nil"/>
-        </w:pBdr>
-        <w:ind w:left="1440"/>
-        <w:rPr>
-          <w:rFonts w:eastAsia="Garamond"/>
-          <w:color w:val="00000A"/>
-        </w:rPr>
-      </w:pPr>
-      <w:r>
-        <w:rPr>
-          <w:rFonts w:eastAsia="Garamond"/>
-          <w:color w:val="000000"/>
-        </w:rPr>
-        <w:t xml:space="preserve">Chapter </w:t>
-      </w:r>
-      <w:r>
-        <w:rPr>
-          <w:rFonts w:eastAsia="Garamond"/>
-          <w:color w:val="00000A"/>
-        </w:rPr>
-        <w:t>6. Interest Rates and Bond Valuation</w:t>
-      </w:r>
-    </w:p>
-    <w:p>
-      <w:pPr>
-        <w:pBdr>
-          <w:top w:val="nil"/>
-          <w:left w:val="nil"/>
-          <w:bottom w:val="nil"/>
-          <w:right w:val="nil"/>
-          <w:between w:val="nil"/>
-        </w:pBdr>
-        <w:ind w:left="1440"/>
-        <w:rPr>
-          <w:rFonts w:eastAsia="Garamond"/>
-          <w:color w:val="000000"/>
-        </w:rPr>
-      </w:pPr>
-      <w:r>
-        <w:rPr>
-          <w:rFonts w:eastAsia="Garamond"/>
-          <w:color w:val="000000"/>
-        </w:rPr>
-        <w:t>Chapter 7. Equity Markets and Stock Valuation</w:t>
-      </w:r>
-    </w:p>
-    <w:p>
-      <w:pPr>
-        <w:pBdr>
-          <w:top w:val="nil"/>
-          <w:left w:val="nil"/>
-          <w:bottom w:val="nil"/>
-          <w:right w:val="nil"/>
-          <w:between w:val="nil"/>
-        </w:pBdr>
-        <w:ind w:left="1440"/>
-        <w:rPr>
-          <w:rFonts w:eastAsia="Garamond"/>
-          <w:color w:val="000000"/>
-        </w:rPr>
-      </w:pPr>
-    </w:p>
-    <w:p>
-      <w:pPr>
-        <w:pBdr>
-          <w:top w:val="nil"/>
-          <w:left w:val="nil"/>
-          <w:bottom w:val="nil"/>
-          <w:right w:val="nil"/>
-          <w:between w:val="nil"/>
-        </w:pBdr>
-        <w:ind w:left="1440"/>
-        <w:rPr>
-          <w:rFonts w:eastAsia="Garamond"/>
-          <w:color w:val="000000"/>
-        </w:rPr>
-      </w:pPr>
-      <w:r>
-        <w:rPr>
-          <w:rFonts w:eastAsia="Garamond"/>
-          <w:color w:val="000000"/>
-        </w:rPr>
-        <w:t>Exam 3</w:t>
-      </w:r>
-      <w:r>
-        <w:rPr>
-          <w:rFonts w:eastAsia="Garamond"/>
-          <w:color w:val="000000"/>
-        </w:rPr>
-        <w:t xml:space="preserve"> (about week 10)</w:t>
-      </w:r>
-    </w:p>
-    <w:p>
-      <w:pPr>
-        <w:pBdr>
-          <w:top w:val="nil"/>
-          <w:left w:val="nil"/>
-          <w:bottom w:val="nil"/>
-          <w:right w:val="nil"/>
-          <w:between w:val="nil"/>
-        </w:pBdr>
-        <w:ind w:left="1440"/>
-        <w:rPr>
-          <w:rFonts w:eastAsia="Garamond"/>
-          <w:color w:val="000000"/>
-        </w:rPr>
-      </w:pPr>
-    </w:p>
-    <w:p>
-      <w:pPr>
-        <w:pBdr>
-          <w:top w:val="nil"/>
-          <w:left w:val="nil"/>
-          <w:bottom w:val="nil"/>
-          <w:right w:val="nil"/>
-          <w:between w:val="nil"/>
-        </w:pBdr>
-        <w:ind w:left="720"/>
-        <w:rPr>
-          <w:rFonts w:eastAsia="Garamond"/>
-          <w:color w:val="000000"/>
-        </w:rPr>
-      </w:pPr>
-      <w:r>
-        <w:rPr>
-          <w:rFonts w:eastAsia="Garamond"/>
-          <w:b/>
-          <w:bCs/>
-          <w:color w:val="000000"/>
-          <w:u w:val="single"/>
-        </w:rPr>
-        <w:t>Module 4</w:t>
-      </w:r>
-      <w:r>
-        <w:rPr>
-          <w:rFonts w:eastAsia="Garamond"/>
+      <w:r>
+        <w:rPr>
+          <w:rFonts w:eastAsia="Garamond"/>
+          <w:b/>
+          <w:bCs/>
+          <w:color w:val="000000"/>
+        </w:rPr>
+        <w:t>3</w:t>
+      </w:r>
+      <w:r>
+        <w:rPr>
+          <w:rFonts w:eastAsia="Garamond"/>
+          <w:b/>
+          <w:bCs/>
+          <w:color w:val="000000"/>
+        </w:rPr>
+        <w:t>0</w:t>
+      </w:r>
+      <w:r>
+        <w:rPr>
+          <w:rFonts w:eastAsia="Garamond"/>
+          <w:b/>
+          <w:bCs/>
+          <w:color w:val="000000"/>
+        </w:rPr>
+        <w:t>am</w:t>
+      </w:r>
+      <w:r>
+        <w:rPr>
+          <w:rFonts w:eastAsia="Garamond"/>
+          <w:b/>
+          <w:bCs/>
+          <w:color w:val="000000"/>
+        </w:rPr>
+        <w:t>-</w:t>
+      </w:r>
+      <w:r>
+        <w:rPr>
+          <w:rFonts w:eastAsia="Garamond"/>
+          <w:b/>
+          <w:bCs/>
+          <w:color w:val="000000"/>
+        </w:rPr>
+        <w:t>12</w:t>
+      </w:r>
+      <w:r>
+        <w:rPr>
+          <w:rFonts w:eastAsia="Garamond"/>
+          <w:b/>
+          <w:bCs/>
           <w:color w:val="000000"/>
         </w:rPr>
         <w:t>:</w:t>
       </w:r>
-    </w:p>
-    <w:p>
-      <w:pPr>
-        <w:pBdr>
-          <w:top w:val="nil"/>
-          <w:left w:val="nil"/>
-          <w:bottom w:val="nil"/>
-          <w:right w:val="nil"/>
-          <w:between w:val="nil"/>
-        </w:pBdr>
-        <w:ind w:left="1440"/>
-        <w:rPr>
-          <w:rFonts w:eastAsia="Garamond"/>
-          <w:color w:val="000000"/>
-        </w:rPr>
-      </w:pPr>
-      <w:r>
-        <w:rPr>
-          <w:rFonts w:eastAsia="Garamond"/>
-          <w:color w:val="000000"/>
-        </w:rPr>
-        <w:t>Chapter 8. Net Present Value and Other Investment Criteria</w:t>
-      </w:r>
-    </w:p>
-    <w:p>
-      <w:pPr>
-        <w:pBdr>
-          <w:top w:val="nil"/>
-          <w:left w:val="nil"/>
-          <w:bottom w:val="nil"/>
-          <w:right w:val="nil"/>
-          <w:between w:val="nil"/>
-        </w:pBdr>
-        <w:ind w:left="1440"/>
-        <w:rPr>
-          <w:rFonts w:eastAsia="Garamond"/>
-          <w:color w:val="000000"/>
-        </w:rPr>
-      </w:pPr>
-      <w:r>
-        <w:rPr>
-          <w:rFonts w:eastAsia="Garamond"/>
-          <w:color w:val="000000"/>
-        </w:rPr>
-        <w:t>Chapter 9. Making Capital Investment Decisions</w:t>
-      </w:r>
-    </w:p>
-    <w:p>
-      <w:pPr>
-        <w:pBdr>
-          <w:top w:val="nil"/>
-          <w:left w:val="nil"/>
-          <w:bottom w:val="nil"/>
-          <w:right w:val="nil"/>
-          <w:between w:val="nil"/>
-        </w:pBdr>
-        <w:ind w:left="1440"/>
-        <w:rPr>
-          <w:rFonts w:eastAsia="Garamond"/>
-          <w:color w:val="000000"/>
-        </w:rPr>
-      </w:pPr>
-      <w:r>
-        <w:rPr>
-          <w:rFonts w:eastAsia="Garamond"/>
-          <w:color w:val="000000"/>
-        </w:rPr>
-        <w:t>Chapter 10. Some Lessons from Capital Market History</w:t>
-      </w:r>
-    </w:p>
-    <w:p>
-      <w:pPr>
-        <w:pBdr>
-          <w:top w:val="nil"/>
-          <w:left w:val="nil"/>
-          <w:bottom w:val="nil"/>
-          <w:right w:val="nil"/>
-          <w:between w:val="nil"/>
-        </w:pBdr>
-        <w:ind w:left="1440"/>
-        <w:rPr>
-          <w:rFonts w:eastAsia="Garamond"/>
-          <w:color w:val="000000"/>
-        </w:rPr>
-      </w:pPr>
-      <w:r>
-        <w:rPr>
-          <w:rFonts w:eastAsia="Garamond"/>
-          <w:color w:val="000000"/>
-        </w:rPr>
-        <w:t>Chapter 11. Risk and Return</w:t>
-      </w:r>
-    </w:p>
-    <w:p>
-      <w:pPr>
-        <w:pBdr>
-          <w:top w:val="nil"/>
-          <w:left w:val="nil"/>
-          <w:bottom w:val="nil"/>
-          <w:right w:val="nil"/>
-          <w:between w:val="nil"/>
-        </w:pBdr>
-        <w:ind w:left="1440"/>
-        <w:rPr>
-          <w:rFonts w:eastAsia="Garamond"/>
-          <w:color w:val="000000"/>
-        </w:rPr>
-      </w:pPr>
-      <w:r>
-        <w:rPr>
-          <w:rFonts w:eastAsia="Garamond"/>
-          <w:color w:val="000000"/>
-        </w:rPr>
-        <w:t>Chapter 12. Cost of Capital</w:t>
-      </w:r>
-    </w:p>
-    <w:p>
-      <w:pPr>
-        <w:pBdr>
-          <w:top w:val="nil"/>
-          <w:left w:val="nil"/>
-          <w:bottom w:val="nil"/>
-          <w:right w:val="nil"/>
-          <w:between w:val="nil"/>
-        </w:pBdr>
-        <w:ind w:left="720"/>
-        <w:rPr>
-          <w:rFonts w:eastAsia="Garamond"/>
-          <w:color w:val="000000"/>
-        </w:rPr>
-      </w:pPr>
-    </w:p>
-    <w:p>
-      <w:pPr>
-        <w:pBdr>
-          <w:top w:val="nil"/>
-          <w:left w:val="nil"/>
-          <w:bottom w:val="nil"/>
-          <w:right w:val="nil"/>
-          <w:between w:val="nil"/>
-        </w:pBdr>
-        <w:ind w:left="720"/>
-        <w:rPr>
-          <w:rFonts w:eastAsia="Garamond"/>
-          <w:color w:val="000000"/>
-        </w:rPr>
-      </w:pPr>
-      <w:r>
-        <w:rPr>
-          <w:rFonts w:eastAsia="Garamond"/>
-          <w:color w:val="000000"/>
-        </w:rPr>
-        <w:tab/>
-      </w:r>
-      <w:r>
-        <w:rPr>
-          <w:rFonts w:eastAsia="Garamond"/>
-          <w:b/>
-          <w:bCs/>
-          <w:color w:val="000000"/>
-        </w:rPr>
-        <w:t xml:space="preserve">Section </w:t>
-      </w:r>
-      <w:r>
-        <w:rPr>
-          <w:rFonts w:eastAsia="Garamond"/>
-          <w:b/>
-          <w:bCs/>
-          <w:color w:val="000000"/>
-        </w:rPr>
-        <w:t>2</w:t>
-      </w:r>
-      <w:r>
-        <w:rPr>
-          <w:rFonts w:eastAsia="Garamond"/>
-          <w:b/>
-          <w:bCs/>
-          <w:color w:val="000000"/>
-        </w:rPr>
-        <w:t xml:space="preserve"> (</w:t>
-      </w:r>
-      <w:r>
-        <w:rPr>
-          <w:rFonts w:eastAsia="Garamond"/>
-          <w:b/>
-          <w:bCs/>
-          <w:color w:val="000000"/>
-        </w:rPr>
-        <w:t>1</w:t>
-      </w:r>
-      <w:r>
-        <w:rPr>
-          <w:rFonts w:eastAsia="Garamond"/>
-          <w:b/>
-          <w:bCs/>
-          <w:color w:val="000000"/>
-        </w:rPr>
-        <w:t>0</w:t>
-      </w:r>
-      <w:r>
-        <w:rPr>
-          <w:rFonts w:eastAsia="Garamond"/>
-          <w:b/>
-          <w:bCs/>
-          <w:color w:val="000000"/>
-        </w:rPr>
-        <w:t xml:space="preserve">:00am </w:t>
-      </w:r>
-      <w:r>
-        <w:rPr>
-          <w:rFonts w:eastAsia="Garamond"/>
-          <w:b/>
-          <w:bCs/>
-          <w:color w:val="000000"/>
-        </w:rPr>
-        <w:t>T</w:t>
-      </w:r>
-      <w:r>
-        <w:rPr>
-          <w:rFonts w:eastAsia="Garamond"/>
-          <w:b/>
-          <w:bCs/>
-          <w:color w:val="000000"/>
-        </w:rPr>
-        <w:t>/</w:t>
-      </w:r>
-      <w:r>
-        <w:rPr>
-          <w:rFonts w:eastAsia="Garamond"/>
-          <w:b/>
-          <w:bCs/>
-          <w:color w:val="000000"/>
-        </w:rPr>
-        <w:t>R</w:t>
-      </w:r>
-      <w:r>
-        <w:rPr>
-          <w:rFonts w:eastAsia="Garamond"/>
-          <w:b/>
-          <w:bCs/>
-          <w:color w:val="000000"/>
-        </w:rPr>
-        <w:t>)</w:t>
-      </w:r>
-      <w:r>
-        <w:rPr>
-          <w:rFonts w:eastAsia="Garamond"/>
-          <w:color w:val="000000"/>
-        </w:rPr>
-        <w:t xml:space="preserve"> - </w:t>
-      </w:r>
-      <w:r>
-        <w:rPr>
-          <w:rFonts w:eastAsia="Garamond"/>
-          <w:color w:val="000000"/>
-        </w:rPr>
-        <w:t xml:space="preserve">Final Exam, </w:t>
-      </w:r>
-      <w:r>
-        <w:rPr>
-          <w:rFonts w:eastAsia="Garamond"/>
-          <w:color w:val="000000"/>
-        </w:rPr>
-        <w:t>T</w:t>
-      </w:r>
-      <w:r>
-        <w:rPr>
-          <w:rFonts w:eastAsia="Garamond"/>
-          <w:color w:val="000000"/>
-        </w:rPr>
-        <w:t>uesd</w:t>
-      </w:r>
-      <w:r>
-        <w:rPr>
-          <w:rFonts w:eastAsia="Garamond"/>
-          <w:color w:val="000000"/>
-        </w:rPr>
-        <w:t>ay</w:t>
-      </w:r>
-      <w:r>
-        <w:rPr>
-          <w:rFonts w:eastAsia="Garamond"/>
-          <w:color w:val="000000"/>
-        </w:rPr>
-        <w:t xml:space="preserve">, </w:t>
-      </w:r>
-      <w:r>
-        <w:rPr>
-          <w:rFonts w:eastAsia="Garamond"/>
-          <w:color w:val="000000"/>
-        </w:rPr>
-        <w:t>5</w:t>
-      </w:r>
-      <w:r>
-        <w:rPr>
-          <w:rFonts w:eastAsia="Garamond"/>
-          <w:color w:val="000000"/>
-        </w:rPr>
-        <w:t>/</w:t>
-      </w:r>
-      <w:r>
-        <w:rPr>
-          <w:rFonts w:eastAsia="Garamond"/>
-          <w:color w:val="000000"/>
-        </w:rPr>
-        <w:t>5</w:t>
-      </w:r>
-      <w:r>
-        <w:rPr>
-          <w:rFonts w:eastAsia="Garamond"/>
-          <w:color w:val="000000"/>
-        </w:rPr>
-        <w:t>/2</w:t>
-      </w:r>
-      <w:r>
-        <w:rPr>
-          <w:rFonts w:eastAsia="Garamond"/>
-          <w:color w:val="000000"/>
-        </w:rPr>
-        <w:t>6</w:t>
-      </w:r>
-      <w:r>
-        <w:rPr>
-          <w:rFonts w:eastAsia="Garamond"/>
-          <w:color w:val="000000"/>
-        </w:rPr>
-        <w:t xml:space="preserve"> at </w:t>
-      </w:r>
-      <w:r>
-        <w:rPr>
-          <w:rFonts w:eastAsia="Garamond"/>
+      <w:r>
+        <w:rPr>
+          <w:rFonts w:eastAsia="Garamond"/>
+          <w:b/>
+          <w:bCs/>
           <w:color w:val="000000"/>
         </w:rPr>
         <w:t>3</w:t>
@@ -2127,195 +2504,31 @@
       <w:r>
         <w:rPr>
           <w:rFonts w:eastAsia="Garamond"/>
-          <w:color w:val="000000"/>
-        </w:rPr>
-        <w:t>:</w:t>
-      </w:r>
-      <w:r>
-        <w:rPr>
-          <w:rFonts w:eastAsia="Garamond"/>
-          <w:color w:val="000000"/>
-        </w:rPr>
-        <w:t>3</w:t>
-      </w:r>
-      <w:r>
-        <w:rPr>
-          <w:rFonts w:eastAsia="Garamond"/>
-          <w:color w:val="000000"/>
-        </w:rPr>
-        <w:t>0-</w:t>
-      </w:r>
-      <w:r>
-        <w:rPr>
-          <w:rFonts w:eastAsia="Garamond"/>
-          <w:color w:val="000000"/>
-        </w:rPr>
-        <w:t>5</w:t>
-      </w:r>
-      <w:r>
-        <w:rPr>
-          <w:rFonts w:eastAsia="Garamond"/>
-          <w:color w:val="000000"/>
-        </w:rPr>
-        <w:t>:</w:t>
-      </w:r>
-      <w:r>
-        <w:rPr>
-          <w:rFonts w:eastAsia="Garamond"/>
-          <w:color w:val="000000"/>
-        </w:rPr>
-        <w:t>3</w:t>
-      </w:r>
-      <w:r>
-        <w:rPr>
-          <w:rFonts w:eastAsia="Garamond"/>
+          <w:b/>
+          <w:bCs/>
           <w:color w:val="000000"/>
         </w:rPr>
         <w:t>0pm</w:t>
       </w:r>
-    </w:p>
-    <w:p>
-      <w:pPr>
-        <w:pBdr>
-          <w:top w:val="nil"/>
-          <w:left w:val="nil"/>
-          <w:bottom w:val="nil"/>
-          <w:right w:val="nil"/>
-          <w:between w:val="nil"/>
-        </w:pBdr>
-        <w:ind w:left="720" w:firstLine="720"/>
-        <w:rPr>
-          <w:rFonts w:eastAsia="Garamond"/>
-          <w:color w:val="00000A"/>
-        </w:rPr>
-      </w:pPr>
-      <w:r>
-        <w:rPr>
-          <w:rFonts w:eastAsia="Garamond"/>
-          <w:b/>
-          <w:bCs/>
-          <w:color w:val="00000A"/>
-        </w:rPr>
-        <w:t>Section 3</w:t>
-      </w:r>
-      <w:r>
-        <w:rPr>
-          <w:rFonts w:eastAsia="Garamond"/>
-          <w:color w:val="00000A"/>
-        </w:rPr>
-        <w:t xml:space="preserve"> </w:t>
-      </w:r>
-      <w:r>
-        <w:rPr>
-          <w:rFonts w:eastAsia="Garamond"/>
-          <w:b/>
-          <w:bCs/>
-          <w:color w:val="00000A"/>
-        </w:rPr>
-        <w:t>(</w:t>
-      </w:r>
-      <w:r>
-        <w:rPr>
-          <w:rFonts w:eastAsia="Garamond"/>
-          <w:b/>
-          <w:bCs/>
-          <w:color w:val="00000A"/>
-        </w:rPr>
-        <w:t xml:space="preserve">11:30am </w:t>
-      </w:r>
-      <w:r>
-        <w:rPr>
-          <w:rFonts w:eastAsia="Garamond"/>
-          <w:b/>
-          <w:bCs/>
-          <w:color w:val="00000A"/>
-        </w:rPr>
-        <w:t>T/R)</w:t>
-      </w:r>
-      <w:r>
-        <w:rPr>
-          <w:rFonts w:eastAsia="Garamond"/>
-          <w:b/>
-          <w:bCs/>
-          <w:color w:val="00000A"/>
-        </w:rPr>
-        <w:t xml:space="preserve"> </w:t>
-      </w:r>
-      <w:r>
-        <w:rPr>
-          <w:rFonts w:eastAsia="Garamond"/>
-          <w:color w:val="00000A"/>
-        </w:rPr>
-        <w:t>-</w:t>
-      </w:r>
-      <w:r>
-        <w:rPr>
-          <w:rFonts w:eastAsia="Garamond"/>
-          <w:color w:val="00000A"/>
-        </w:rPr>
-        <w:t xml:space="preserve"> Final Exam, Wednesday, </w:t>
-      </w:r>
-      <w:r>
-        <w:rPr>
-          <w:rFonts w:eastAsia="Garamond"/>
-          <w:color w:val="00000A"/>
-        </w:rPr>
-        <w:t>5</w:t>
-      </w:r>
-      <w:r>
-        <w:rPr>
-          <w:rFonts w:eastAsia="Garamond"/>
-          <w:color w:val="00000A"/>
-        </w:rPr>
-        <w:t>/</w:t>
-      </w:r>
-      <w:r>
-        <w:rPr>
-          <w:rFonts w:eastAsia="Garamond"/>
-          <w:color w:val="00000A"/>
-        </w:rPr>
-        <w:t>6</w:t>
-      </w:r>
-      <w:r>
-        <w:rPr>
-          <w:rFonts w:eastAsia="Garamond"/>
-          <w:color w:val="00000A"/>
-        </w:rPr>
-        <w:t>/2</w:t>
-      </w:r>
-      <w:r>
-        <w:rPr>
-          <w:rFonts w:eastAsia="Garamond"/>
-          <w:color w:val="00000A"/>
-        </w:rPr>
-        <w:t>6</w:t>
-      </w:r>
-      <w:r>
-        <w:rPr>
-          <w:rFonts w:eastAsia="Garamond"/>
-          <w:color w:val="00000A"/>
-        </w:rPr>
-        <w:t xml:space="preserve"> at 10:30-12:30pm</w:t>
-      </w:r>
-    </w:p>
-    <w:p>
-      <w:pPr>
-        <w:pBdr>
-          <w:top w:val="nil"/>
-          <w:left w:val="nil"/>
-          <w:bottom w:val="nil"/>
-          <w:right w:val="nil"/>
-          <w:between w:val="nil"/>
-        </w:pBdr>
-        <w:ind w:left="1440"/>
-        <w:rPr>
-          <w:rFonts w:eastAsia="Garamond"/>
-          <w:color w:val="00000A"/>
-        </w:rPr>
-      </w:pPr>
-    </w:p>
-    <w:p>
-      <w:pPr>
+      <w:r>
+        <w:rPr>
+          <w:rFonts w:eastAsia="Garamond"/>
+          <w:b/>
+          <w:bCs/>
+          <w:color w:val="000000"/>
+        </w:rPr>
+        <w:t xml:space="preserve"> in our classroom.</w:t>
+      </w:r>
+    </w:p>
+    <w:p>
+      <w:pPr>
+        <w:pBdr>
+          <w:top w:val="nil"/>
+          <w:left w:val="nil"/>
+          <w:bottom w:val="nil"/>
+          <w:right w:val="nil"/>
+          <w:between w:val="nil"/>
+        </w:pBdr>
         <w:rPr>
           <w:rFonts w:eastAsia="Garamond"/>
           <w:b/>
@@ -2332,18 +2545,67 @@
           <w:sz w:val="28"/>
           <w:szCs w:val="28"/>
         </w:rPr>
-        <w:br w:type="page"/>
-      </w:r>
-    </w:p>
-    <w:p>
-      <w:pPr>
-        <w:pBdr>
-          <w:top w:val="nil"/>
-          <w:left w:val="nil"/>
-          <w:bottom w:val="nil"/>
-          <w:right w:val="nil"/>
-          <w:between w:val="nil"/>
-        </w:pBdr>
+        <w:lastRenderedPageBreak/>
+        <w:t>International Simulation Project:</w:t>
+      </w:r>
+    </w:p>
+    <w:p>
+      <w:pPr>
+        <w:pStyle w:val="p1"/>
+      </w:pPr>
+      <w:r>
+        <w:t>This course includes a</w:t>
+      </w:r>
+      <w:r>
+        <w:t>n</w:t>
+      </w:r>
+      <w:r>
+        <w:t xml:space="preserve"> international finance simulation in which students work in teams representing fictional countries within a shared global economic system. Each team </w:t>
+      </w:r>
+      <w:r>
+        <w:t xml:space="preserve">will </w:t>
+      </w:r>
+      <w:r>
+        <w:t>make</w:t>
+      </w:r>
+      <w:r>
+        <w:t xml:space="preserve"> national</w:t>
+      </w:r>
+      <w:r>
+        <w:t xml:space="preserve"> policy decisions related to exchange rates, capital flows, trade, and financial stability in response to evolving economic conditions and </w:t>
+      </w:r>
+      <w:r>
+        <w:t>(simulated) world events</w:t>
+      </w:r>
+      <w:r>
+        <w:t>. The simulation is designed to reinforce core international finance concepts by placing students in realistic decision-making roles and highlighting the trade-offs, constraints, and institutional challenges faced by governments, central banks, and firms.</w:t>
+      </w:r>
+      <w:r>
+        <w:t xml:space="preserve"> Each group (country) will be required to submit policy documents periodically.</w:t>
+      </w:r>
+    </w:p>
+    <w:p>
+      <w:pPr>
+        <w:pStyle w:val="p1"/>
+      </w:pPr>
+      <w:r>
+        <w:t xml:space="preserve">There will be eight countries of about five students each. You may select your teammates. </w:t>
+      </w:r>
+      <w:r>
+        <w:t xml:space="preserve">Grades will be for the team, not individually.  </w:t>
+      </w:r>
+    </w:p>
+    <w:p>
+      <w:pPr>
+        <w:pStyle w:val="p1"/>
+      </w:pPr>
+      <w:r>
+        <w:t>We will discuss this more in the first weeks of the semester.</w:t>
+      </w:r>
+    </w:p>
+    <w:p>
+      <w:pPr>
+        <w:pStyle w:val="p1"/>
         <w:rPr>
           <w:rFonts w:eastAsia="Garamond"/>
           <w:b/>
@@ -2352,7 +2614,16 @@
           <w:szCs w:val="28"/>
         </w:rPr>
       </w:pPr>
-      <w:r>
+    </w:p>
+    <w:p>
+      <w:pPr>
+        <w:pBdr>
+          <w:top w:val="nil"/>
+          <w:left w:val="nil"/>
+          <w:bottom w:val="nil"/>
+          <w:right w:val="nil"/>
+          <w:between w:val="nil"/>
+        </w:pBdr>
         <w:rPr>
           <w:rFonts w:eastAsia="Garamond"/>
           <w:b/>
@@ -2360,37 +2631,8 @@
           <w:sz w:val="28"/>
           <w:szCs w:val="28"/>
         </w:rPr>
-        <w:lastRenderedPageBreak/>
-        <w:t>What I expect from you:</w:t>
-      </w:r>
-    </w:p>
-    <w:p>
-      <w:pPr>
-        <w:pBdr>
-          <w:top w:val="nil"/>
-          <w:left w:val="nil"/>
-          <w:bottom w:val="nil"/>
-          <w:right w:val="nil"/>
-          <w:between w:val="nil"/>
-        </w:pBdr>
-        <w:rPr>
-          <w:rFonts w:eastAsia="Garamond"/>
-          <w:b/>
-          <w:color w:val="2E74B5"/>
-          <w:sz w:val="20"/>
-          <w:szCs w:val="20"/>
-        </w:rPr>
-      </w:pPr>
-    </w:p>
-    <w:p>
-      <w:pPr>
-        <w:pBdr>
-          <w:top w:val="nil"/>
-          <w:left w:val="nil"/>
-          <w:bottom w:val="nil"/>
-          <w:right w:val="nil"/>
-          <w:between w:val="nil"/>
-        </w:pBdr>
+      </w:pPr>
+      <w:r>
         <w:rPr>
           <w:rFonts w:eastAsia="Garamond"/>
           <w:b/>
@@ -2398,649 +2640,6 @@
           <w:sz w:val="28"/>
           <w:szCs w:val="28"/>
         </w:rPr>
-      </w:pPr>
-      <w:r>
-        <w:rPr>
-          <w:rFonts w:eastAsia="Garamond"/>
-          <w:b/>
-          <w:color w:val="2E74B5"/>
-          <w:sz w:val="28"/>
-          <w:szCs w:val="28"/>
-        </w:rPr>
-        <w:t>Coursework and Expectations:</w:t>
-      </w:r>
-    </w:p>
-    <w:p>
-      <w:pPr>
-        <w:pBdr>
-          <w:top w:val="nil"/>
-          <w:left w:val="nil"/>
-          <w:bottom w:val="nil"/>
-          <w:right w:val="nil"/>
-          <w:between w:val="nil"/>
-        </w:pBdr>
-        <w:rPr>
-          <w:rFonts w:eastAsia="Garamond"/>
-          <w:b/>
-          <w:color w:val="2E74B5"/>
-          <w:sz w:val="20"/>
-          <w:szCs w:val="28"/>
-        </w:rPr>
-      </w:pPr>
-    </w:p>
-    <w:p>
-      <w:pPr>
-        <w:pBdr>
-          <w:top w:val="nil"/>
-          <w:left w:val="nil"/>
-          <w:bottom w:val="nil"/>
-          <w:right w:val="nil"/>
-          <w:between w:val="nil"/>
-        </w:pBdr>
-        <w:rPr>
-          <w:rFonts w:eastAsia="Garamond"/>
-          <w:b/>
-          <w:color w:val="2E74B5"/>
-          <w:sz w:val="28"/>
-          <w:szCs w:val="28"/>
-        </w:rPr>
-      </w:pPr>
-      <w:r>
-        <w:rPr>
-          <w:rFonts w:eastAsia="Garamond"/>
-          <w:b/>
-        </w:rPr>
-        <w:t>Assignments:</w:t>
-      </w:r>
-    </w:p>
-    <w:p>
-      <w:pPr>
-        <w:pStyle w:val="ListParagraph"/>
-        <w:ind w:left="1080"/>
-        <w:rPr>
-          <w:rFonts w:eastAsia="Garamond" w:cs="Times New Roman"/>
-          <w:color w:val="00000A"/>
-          <w:sz w:val="16"/>
-          <w:szCs w:val="16"/>
-        </w:rPr>
-      </w:pPr>
-    </w:p>
-    <w:p>
-      <w:pPr>
-        <w:pStyle w:val="ListParagraph"/>
-        <w:numPr>
-          <w:ilvl w:val="0"/>
-          <w:numId w:val="11"/>
-        </w:numPr>
-        <w:rPr>
-          <w:rFonts w:eastAsia="Garamond" w:cs="Times New Roman"/>
-          <w:color w:val="00000A"/>
-        </w:rPr>
-      </w:pPr>
-      <w:r>
-        <w:rPr>
-          <w:rFonts w:eastAsia="Garamond" w:cs="Times New Roman"/>
-          <w:color w:val="00000A"/>
-        </w:rPr>
-        <w:t>You are expected to attend all class periods, participate in discussions, and ask questions if/when necessary.</w:t>
-      </w:r>
-      <w:r>
-        <w:rPr>
-          <w:rFonts w:eastAsia="Garamond" w:cs="Times New Roman"/>
-          <w:color w:val="00000A"/>
-        </w:rPr>
-        <w:t xml:space="preserve"> </w:t>
-      </w:r>
-    </w:p>
-    <w:p>
-      <w:pPr>
-        <w:pStyle w:val="ListParagraph"/>
-        <w:rPr>
-          <w:rFonts w:eastAsia="Garamond" w:cs="Times New Roman"/>
-        </w:rPr>
-      </w:pPr>
-    </w:p>
-    <w:p>
-      <w:pPr>
-        <w:pStyle w:val="ListParagraph"/>
-        <w:numPr>
-          <w:ilvl w:val="0"/>
-          <w:numId w:val="11"/>
-        </w:numPr>
-        <w:rPr>
-          <w:rFonts w:eastAsia="Garamond" w:cs="Times New Roman"/>
-        </w:rPr>
-      </w:pPr>
-      <w:r>
-        <w:rPr>
-          <w:rFonts w:eastAsia="Garamond" w:cs="Times New Roman"/>
-        </w:rPr>
-        <w:t xml:space="preserve">Homework and </w:t>
-      </w:r>
-      <w:r>
-        <w:rPr>
-          <w:rFonts w:eastAsia="Garamond" w:cs="Times New Roman"/>
-        </w:rPr>
-        <w:t>Problems</w:t>
-      </w:r>
-      <w:r>
-        <w:rPr>
-          <w:rFonts w:eastAsia="Garamond" w:cs="Times New Roman"/>
-        </w:rPr>
-        <w:t xml:space="preserve">: There will be </w:t>
-      </w:r>
-      <w:r>
-        <w:rPr>
-          <w:rFonts w:eastAsia="Garamond" w:cs="Times New Roman"/>
-        </w:rPr>
-        <w:t>H</w:t>
-      </w:r>
-      <w:r>
-        <w:rPr>
-          <w:rFonts w:eastAsia="Garamond" w:cs="Times New Roman"/>
-        </w:rPr>
-        <w:t>omework assignment</w:t>
-      </w:r>
-      <w:r>
-        <w:rPr>
-          <w:rFonts w:eastAsia="Garamond" w:cs="Times New Roman"/>
-        </w:rPr>
-        <w:t>s</w:t>
-      </w:r>
-      <w:r>
-        <w:rPr>
-          <w:rFonts w:eastAsia="Garamond" w:cs="Times New Roman"/>
-        </w:rPr>
-        <w:t xml:space="preserve"> and </w:t>
-      </w:r>
-      <w:r>
-        <w:rPr>
-          <w:rFonts w:eastAsia="Garamond" w:cs="Times New Roman"/>
-        </w:rPr>
-        <w:t>Problem Sets</w:t>
-      </w:r>
-      <w:r>
-        <w:rPr>
-          <w:rFonts w:eastAsia="Garamond" w:cs="Times New Roman"/>
-        </w:rPr>
-        <w:t xml:space="preserve"> throughout the semester</w:t>
-      </w:r>
-      <w:r>
-        <w:rPr>
-          <w:rFonts w:eastAsia="Garamond" w:cs="Times New Roman"/>
-        </w:rPr>
-        <w:t xml:space="preserve">. </w:t>
-      </w:r>
-      <w:r>
-        <w:rPr>
-          <w:rFonts w:eastAsia="Garamond" w:cs="Times New Roman"/>
-        </w:rPr>
-        <w:t>H</w:t>
-      </w:r>
-      <w:r>
-        <w:rPr>
-          <w:rFonts w:eastAsia="Garamond" w:cs="Times New Roman"/>
-        </w:rPr>
-        <w:t xml:space="preserve">omework </w:t>
-      </w:r>
-      <w:r>
-        <w:rPr>
-          <w:rFonts w:eastAsia="Garamond" w:cs="Times New Roman"/>
-        </w:rPr>
-        <w:t xml:space="preserve">and </w:t>
-      </w:r>
-      <w:r>
-        <w:rPr>
-          <w:rFonts w:eastAsia="Garamond" w:cs="Times New Roman"/>
-        </w:rPr>
-        <w:t>Problem Sets</w:t>
-      </w:r>
-      <w:r>
-        <w:rPr>
-          <w:rFonts w:eastAsia="Garamond" w:cs="Times New Roman"/>
-        </w:rPr>
-        <w:t xml:space="preserve"> will either be assigned in class or posted on Canvas</w:t>
-      </w:r>
-      <w:r>
-        <w:rPr>
-          <w:rFonts w:eastAsia="Garamond" w:cs="Times New Roman"/>
-        </w:rPr>
-        <w:t xml:space="preserve">. All homework assignments </w:t>
-      </w:r>
-      <w:r>
-        <w:rPr>
-          <w:rFonts w:eastAsia="Garamond" w:cs="Times New Roman"/>
-        </w:rPr>
-        <w:t xml:space="preserve">(both) </w:t>
-      </w:r>
-      <w:r>
-        <w:rPr>
-          <w:rFonts w:eastAsia="Garamond" w:cs="Times New Roman"/>
-        </w:rPr>
-        <w:t xml:space="preserve">may be completed in groups. I fully expect (and encourage) you to work together. </w:t>
-      </w:r>
-      <w:r>
-        <w:rPr>
-          <w:rFonts w:eastAsia="Garamond" w:cs="Times New Roman"/>
-        </w:rPr>
-        <w:t>However, remember that the tests will be done independently in class. So do not just copy other students work.</w:t>
-      </w:r>
-    </w:p>
-    <w:p>
-      <w:pPr>
-        <w:pStyle w:val="ListParagraph"/>
-        <w:rPr>
-          <w:rFonts w:eastAsia="Garamond" w:cs="Times New Roman"/>
-        </w:rPr>
-      </w:pPr>
-    </w:p>
-    <w:p>
-      <w:pPr>
-        <w:pStyle w:val="ListParagraph"/>
-        <w:numPr>
-          <w:ilvl w:val="0"/>
-          <w:numId w:val="11"/>
-        </w:numPr>
-        <w:rPr>
-          <w:rFonts w:eastAsia="Garamond" w:cs="Times New Roman"/>
-        </w:rPr>
-      </w:pPr>
-      <w:r>
-        <w:rPr>
-          <w:rFonts w:eastAsia="Garamond" w:cs="Times New Roman"/>
-        </w:rPr>
-        <w:t>You may use a computer to do any of your homework. But you need to make sure that you can complete the work on your calculator as well. For exams, you will only have access to your calculator.</w:t>
-      </w:r>
-    </w:p>
-    <w:p>
-      <w:pPr>
-        <w:pBdr>
-          <w:top w:val="nil"/>
-          <w:left w:val="nil"/>
-          <w:bottom w:val="nil"/>
-          <w:right w:val="nil"/>
-          <w:between w:val="nil"/>
-        </w:pBdr>
-        <w:ind w:firstLine="720"/>
-        <w:rPr>
-          <w:rFonts w:eastAsia="Garamond"/>
-          <w:color w:val="00000A"/>
-        </w:rPr>
-      </w:pPr>
-    </w:p>
-    <w:p>
-      <w:pPr>
-        <w:pStyle w:val="ListParagraph"/>
-        <w:numPr>
-          <w:ilvl w:val="0"/>
-          <w:numId w:val="11"/>
-        </w:numPr>
-        <w:pBdr>
-          <w:top w:val="nil"/>
-          <w:left w:val="nil"/>
-          <w:bottom w:val="nil"/>
-          <w:right w:val="nil"/>
-          <w:between w:val="nil"/>
-        </w:pBdr>
-        <w:rPr>
-          <w:rFonts w:eastAsia="Garamond"/>
-          <w:color w:val="00000A"/>
-        </w:rPr>
-      </w:pPr>
-      <w:r>
-        <w:rPr>
-          <w:rFonts w:eastAsia="Garamond"/>
-          <w:color w:val="00000A"/>
-        </w:rPr>
-        <w:t>Most homework assignments are based on completion and showing an effort to work the problems. Therefore, generally, they will only be worth about 5 points. Any late assignments will lose points depending on how late they are submitted.</w:t>
-      </w:r>
-    </w:p>
-    <w:p>
-      <w:pPr>
-        <w:pBdr>
-          <w:top w:val="nil"/>
-          <w:left w:val="nil"/>
-          <w:bottom w:val="nil"/>
-          <w:right w:val="nil"/>
-          <w:between w:val="nil"/>
-        </w:pBdr>
-        <w:ind w:firstLine="720"/>
-        <w:rPr>
-          <w:rFonts w:eastAsia="Garamond"/>
-          <w:color w:val="00000A"/>
-        </w:rPr>
-      </w:pPr>
-    </w:p>
-    <w:p>
-      <w:pPr>
-        <w:pBdr>
-          <w:top w:val="nil"/>
-          <w:left w:val="nil"/>
-          <w:bottom w:val="nil"/>
-          <w:right w:val="nil"/>
-          <w:between w:val="nil"/>
-        </w:pBdr>
-        <w:ind w:firstLine="720"/>
-        <w:rPr>
-          <w:rFonts w:eastAsia="Garamond"/>
-          <w:b/>
-          <w:bCs/>
-          <w:color w:val="00000A"/>
-        </w:rPr>
-      </w:pPr>
-      <w:r>
-        <w:rPr>
-          <w:rFonts w:eastAsia="Garamond"/>
-          <w:b/>
-          <w:bCs/>
-          <w:color w:val="00000A"/>
-        </w:rPr>
-        <w:t>***Other assignments may be added as needed. ***</w:t>
-      </w:r>
-    </w:p>
-    <w:p>
-      <w:pPr>
-        <w:pBdr>
-          <w:top w:val="nil"/>
-          <w:left w:val="nil"/>
-          <w:bottom w:val="nil"/>
-          <w:right w:val="nil"/>
-          <w:between w:val="nil"/>
-        </w:pBdr>
-        <w:ind w:firstLine="720"/>
-        <w:rPr>
-          <w:rFonts w:eastAsia="Garamond"/>
-          <w:b/>
-          <w:bCs/>
-          <w:color w:val="00000A"/>
-        </w:rPr>
-      </w:pPr>
-    </w:p>
-    <w:p>
-      <w:pPr>
-        <w:pBdr>
-          <w:top w:val="nil"/>
-          <w:left w:val="nil"/>
-          <w:bottom w:val="nil"/>
-          <w:right w:val="nil"/>
-          <w:between w:val="nil"/>
-        </w:pBdr>
-        <w:ind w:firstLine="720"/>
-        <w:rPr>
-          <w:rFonts w:eastAsia="Garamond"/>
-          <w:b/>
-          <w:bCs/>
-          <w:color w:val="00000A"/>
-        </w:rPr>
-      </w:pPr>
-      <w:r>
-        <w:rPr>
-          <w:rFonts w:eastAsia="Garamond"/>
-          <w:color w:val="00000A"/>
-        </w:rPr>
-        <w:t>Testing procedures: The course will have three exams that will cover a selection of the material. Additionally, the course will conclude with</w:t>
-      </w:r>
-      <w:r>
-        <w:rPr>
-          <w:rFonts w:eastAsia="Garamond"/>
-          <w:b/>
-          <w:bCs/>
-          <w:color w:val="00000A"/>
-        </w:rPr>
-        <w:t xml:space="preserve"> </w:t>
-      </w:r>
-      <w:r>
-        <w:rPr>
-          <w:rFonts w:eastAsia="Garamond"/>
-          <w:color w:val="00000A"/>
-        </w:rPr>
-        <w:t xml:space="preserve">a final exam that will cover a portion of new material as well as a portion of the material previously covered in the earlier exams. All examinations will occur in class and on paper. </w:t>
-      </w:r>
-      <w:r>
-        <w:rPr>
-          <w:rFonts w:eastAsia="Garamond"/>
-          <w:b/>
-          <w:bCs/>
-          <w:color w:val="00000A"/>
-        </w:rPr>
-        <w:t>(You may use a 4x6 inch notecard for your exam</w:t>
-      </w:r>
-      <w:r>
-        <w:rPr>
-          <w:rFonts w:eastAsia="Garamond"/>
-          <w:b/>
-          <w:bCs/>
-          <w:color w:val="00000A"/>
-        </w:rPr>
-        <w:t>, but you must turn in your notecard along with the exam.)</w:t>
-      </w:r>
-    </w:p>
-    <w:p>
-      <w:pPr>
-        <w:pBdr>
-          <w:top w:val="nil"/>
-          <w:left w:val="nil"/>
-          <w:bottom w:val="nil"/>
-          <w:right w:val="nil"/>
-          <w:between w:val="nil"/>
-        </w:pBdr>
-        <w:ind w:firstLine="720"/>
-        <w:rPr>
-          <w:rFonts w:eastAsia="Garamond"/>
-          <w:color w:val="00000A"/>
-        </w:rPr>
-      </w:pPr>
-    </w:p>
-    <w:p>
-      <w:pPr>
-        <w:pBdr>
-          <w:top w:val="nil"/>
-          <w:left w:val="nil"/>
-          <w:bottom w:val="nil"/>
-          <w:right w:val="nil"/>
-          <w:between w:val="nil"/>
-        </w:pBdr>
-        <w:ind w:firstLine="720"/>
-        <w:rPr>
-          <w:rFonts w:eastAsia="Garamond"/>
-          <w:color w:val="00000A"/>
-        </w:rPr>
-      </w:pPr>
-      <w:r>
-        <w:rPr>
-          <w:rFonts w:eastAsia="Garamond"/>
-          <w:color w:val="00000A"/>
-        </w:rPr>
-        <w:t xml:space="preserve">Timing of the exams: I am planning for our exams to occur approximately every four weeks. However, these </w:t>
-      </w:r>
-      <w:r>
-        <w:rPr>
-          <w:rFonts w:eastAsia="Garamond"/>
-          <w:color w:val="00000A"/>
-        </w:rPr>
-        <w:t>times</w:t>
-      </w:r>
-      <w:r>
-        <w:rPr>
-          <w:rFonts w:eastAsia="Garamond"/>
-          <w:color w:val="00000A"/>
-        </w:rPr>
-        <w:t xml:space="preserve"> are not written in </w:t>
-      </w:r>
-      <w:r>
-        <w:rPr>
-          <w:rFonts w:eastAsia="Garamond"/>
-          <w:color w:val="00000A"/>
-        </w:rPr>
-        <w:t>stone</w:t>
-      </w:r>
-      <w:r>
-        <w:rPr>
-          <w:rFonts w:eastAsia="Garamond"/>
-          <w:color w:val="00000A"/>
-        </w:rPr>
-        <w:t xml:space="preserve">. </w:t>
-      </w:r>
-      <w:r>
-        <w:rPr>
-          <w:rFonts w:eastAsia="Garamond"/>
-          <w:color w:val="00000A"/>
-        </w:rPr>
-        <w:t>They will occur when we have covered the appropriate material.</w:t>
-      </w:r>
-      <w:r>
-        <w:rPr>
-          <w:rFonts w:eastAsia="Garamond"/>
-          <w:color w:val="00000A"/>
-        </w:rPr>
-        <w:t xml:space="preserve"> We will discuss timing of the exams in class.</w:t>
-      </w:r>
-    </w:p>
-    <w:p>
-      <w:pPr>
-        <w:pBdr>
-          <w:top w:val="nil"/>
-          <w:left w:val="nil"/>
-          <w:bottom w:val="nil"/>
-          <w:right w:val="nil"/>
-          <w:between w:val="nil"/>
-        </w:pBdr>
-        <w:ind w:firstLine="720"/>
-        <w:rPr>
-          <w:rFonts w:eastAsia="Garamond"/>
-          <w:color w:val="00000A"/>
-        </w:rPr>
-      </w:pPr>
-    </w:p>
-    <w:p>
-      <w:pPr>
-        <w:pBdr>
-          <w:top w:val="nil"/>
-          <w:left w:val="nil"/>
-          <w:bottom w:val="nil"/>
-          <w:right w:val="nil"/>
-          <w:between w:val="nil"/>
-        </w:pBdr>
-        <w:rPr>
-          <w:rFonts w:eastAsia="Garamond"/>
-          <w:bCs/>
-          <w:color w:val="000000" w:themeColor="text1"/>
-        </w:rPr>
-      </w:pPr>
-      <w:r>
-        <w:rPr>
-          <w:rFonts w:eastAsia="Garamond"/>
-          <w:b/>
-          <w:color w:val="000000" w:themeColor="text1"/>
-        </w:rPr>
-        <w:t xml:space="preserve">Office hours - </w:t>
-      </w:r>
-      <w:r>
-        <w:rPr>
-          <w:rFonts w:eastAsia="Garamond"/>
-          <w:bCs/>
-          <w:color w:val="000000" w:themeColor="text1"/>
-        </w:rPr>
-        <w:t>I will maintain office hours posted outside my office. This time is an extension of our class time. This time is reserved for you should you need to talk with me</w:t>
-      </w:r>
-      <w:r>
-        <w:rPr>
-          <w:rFonts w:eastAsia="Garamond"/>
-          <w:bCs/>
-          <w:color w:val="000000" w:themeColor="text1"/>
-        </w:rPr>
-        <w:t xml:space="preserve"> about class</w:t>
-      </w:r>
-      <w:r>
-        <w:rPr>
-          <w:rFonts w:eastAsia="Garamond"/>
-          <w:bCs/>
-          <w:color w:val="000000" w:themeColor="text1"/>
-        </w:rPr>
-        <w:t>. If those times do not work for you, or something should arise outside of class or office hours, you may email me to schedule another meeting time. Please plan accordingly.</w:t>
-      </w:r>
-    </w:p>
-    <w:p>
-      <w:pPr>
-        <w:pBdr>
-          <w:top w:val="nil"/>
-          <w:left w:val="nil"/>
-          <w:bottom w:val="nil"/>
-          <w:right w:val="nil"/>
-          <w:between w:val="nil"/>
-        </w:pBdr>
-        <w:rPr>
-          <w:rFonts w:eastAsia="Garamond"/>
-          <w:bCs/>
-          <w:color w:val="000000" w:themeColor="text1"/>
-        </w:rPr>
-      </w:pPr>
-    </w:p>
-    <w:p>
-      <w:r>
-        <w:rPr>
-          <w:b/>
-          <w:bCs/>
-        </w:rPr>
-        <w:t xml:space="preserve">Phones and laptops in class – </w:t>
-      </w:r>
-      <w:r>
-        <w:t xml:space="preserve">There will be no phone usage </w:t>
-      </w:r>
-      <w:r>
-        <w:t xml:space="preserve">in </w:t>
-      </w:r>
-      <w:r>
-        <w:t>class. Computer usage should be limited to course material during class. If you have a question regarding a homework or quiz question, you may discuss it with me after class or during office hours.</w:t>
-      </w:r>
-    </w:p>
-    <w:p>
-      <w:pPr>
-        <w:rPr>
-          <w:rFonts w:eastAsia="Garamond"/>
-          <w:b/>
-          <w:color w:val="2E74B5"/>
-          <w:sz w:val="28"/>
-          <w:szCs w:val="28"/>
-        </w:rPr>
-      </w:pPr>
-      <w:r>
-        <w:rPr>
-          <w:rFonts w:eastAsia="Garamond"/>
-          <w:b/>
-          <w:color w:val="2E74B5"/>
-          <w:sz w:val="28"/>
-          <w:szCs w:val="28"/>
-        </w:rPr>
-        <w:br w:type="page"/>
-      </w:r>
-    </w:p>
-    <w:p>
-      <w:pPr>
-        <w:pBdr>
-          <w:top w:val="nil"/>
-          <w:left w:val="nil"/>
-          <w:bottom w:val="nil"/>
-          <w:right w:val="nil"/>
-          <w:between w:val="nil"/>
-        </w:pBdr>
-        <w:rPr>
-          <w:rFonts w:eastAsia="Garamond"/>
-          <w:b/>
-          <w:color w:val="2E74B5"/>
-          <w:sz w:val="28"/>
-          <w:szCs w:val="28"/>
-        </w:rPr>
-      </w:pPr>
-      <w:r>
-        <w:rPr>
-          <w:rFonts w:eastAsia="Garamond"/>
-          <w:b/>
-          <w:color w:val="2E74B5"/>
-          <w:sz w:val="28"/>
-          <w:szCs w:val="28"/>
-        </w:rPr>
-        <w:lastRenderedPageBreak/>
         <w:t>Grading Scale and Point Distribution:</w:t>
       </w:r>
     </w:p>
@@ -3187,28 +2786,14 @@
                 <w:rFonts w:ascii="Times New Roman" w:hAnsi="Times New Roman"/>
                 <w:lang w:eastAsia="ja-JP"/>
               </w:rPr>
-              <w:t xml:space="preserve">Review </w:t>
+              <w:t>Problem</w:t>
             </w:r>
             <w:r>
               <w:rPr>
                 <w:rFonts w:ascii="Times New Roman" w:hAnsi="Times New Roman"/>
                 <w:lang w:eastAsia="ja-JP"/>
               </w:rPr>
-              <w:t>Q</w:t>
-            </w:r>
-            <w:r>
-              <w:rPr>
-                <w:rFonts w:ascii="Times New Roman" w:hAnsi="Times New Roman"/>
-                <w:lang w:eastAsia="ja-JP"/>
-              </w:rPr>
-              <w:t>uestions</w:t>
-            </w:r>
-            <w:r>
-              <w:rPr>
-                <w:rFonts w:ascii="Times New Roman" w:hAnsi="Times New Roman"/>
-                <w:lang w:eastAsia="ja-JP"/>
-              </w:rPr>
-              <w:t xml:space="preserve"> (5 pts per assignment)</w:t>
+              <w:t xml:space="preserve"> Sets (10 pts per assignment)</w:t>
             </w:r>
           </w:p>
         </w:tc>
@@ -3256,21 +2841,28 @@
                 <w:rFonts w:ascii="Times New Roman" w:hAnsi="Times New Roman"/>
                 <w:lang w:eastAsia="ja-JP"/>
               </w:rPr>
-              <w:t>Problem</w:t>
+              <w:t>Quizzes</w:t>
             </w:r>
             <w:r>
               <w:rPr>
                 <w:rFonts w:ascii="Times New Roman" w:hAnsi="Times New Roman"/>
                 <w:lang w:eastAsia="ja-JP"/>
               </w:rPr>
-              <w:t xml:space="preserve"> Sets</w:t>
+              <w:t xml:space="preserve"> (10 pts per </w:t>
             </w:r>
             <w:r>
               <w:rPr>
                 <w:rFonts w:ascii="Times New Roman" w:hAnsi="Times New Roman"/>
                 <w:lang w:eastAsia="ja-JP"/>
               </w:rPr>
-              <w:t xml:space="preserve"> (10 pts per assignment)</w:t>
+              <w:t>quiz on Canvas</w:t>
+            </w:r>
+            <w:r>
+              <w:rPr>
+                <w:rFonts w:ascii="Times New Roman" w:hAnsi="Times New Roman"/>
+                <w:lang w:eastAsia="ja-JP"/>
+              </w:rPr>
+              <w:t>)</w:t>
             </w:r>
           </w:p>
         </w:tc>
@@ -3310,8 +2902,6 @@
               <w:spacing w:after="0" w:line="240" w:lineRule="auto"/>
               <w:rPr>
                 <w:rFonts w:ascii="Times New Roman" w:hAnsi="Times New Roman"/>
-                <w:i/>
-                <w:iCs/>
                 <w:lang w:eastAsia="ja-JP"/>
               </w:rPr>
             </w:pPr>
@@ -3320,7 +2910,14 @@
                 <w:rFonts w:ascii="Times New Roman" w:hAnsi="Times New Roman"/>
                 <w:lang w:eastAsia="ja-JP"/>
               </w:rPr>
-              <w:t>Class Participation</w:t>
+              <w:t>Simulation</w:t>
+            </w:r>
+            <w:r>
+              <w:rPr>
+                <w:rFonts w:ascii="Times New Roman" w:hAnsi="Times New Roman"/>
+                <w:lang w:eastAsia="ja-JP"/>
+              </w:rPr>
+              <w:t xml:space="preserve"> (in and out of the classroom)</w:t>
             </w:r>
           </w:p>
         </w:tc>
@@ -3849,6 +3446,739 @@
         <w:rPr>
           <w:rFonts w:eastAsia="Garamond"/>
           <w:b/>
+          <w:color w:val="2E74B5"/>
+          <w:sz w:val="28"/>
+          <w:szCs w:val="28"/>
+        </w:rPr>
+      </w:pPr>
+    </w:p>
+    <w:p>
+      <w:pPr>
+        <w:rPr>
+          <w:rFonts w:eastAsia="Garamond"/>
+          <w:b/>
+          <w:color w:val="2E74B5"/>
+          <w:sz w:val="28"/>
+          <w:szCs w:val="28"/>
+        </w:rPr>
+      </w:pPr>
+      <w:r>
+        <w:rPr>
+          <w:rFonts w:eastAsia="Garamond"/>
+          <w:b/>
+          <w:color w:val="2E74B5"/>
+          <w:sz w:val="28"/>
+          <w:szCs w:val="28"/>
+        </w:rPr>
+        <w:br w:type="page"/>
+      </w:r>
+    </w:p>
+    <w:p>
+      <w:pPr>
+        <w:pBdr>
+          <w:top w:val="nil"/>
+          <w:left w:val="nil"/>
+          <w:bottom w:val="nil"/>
+          <w:right w:val="nil"/>
+          <w:between w:val="nil"/>
+        </w:pBdr>
+        <w:rPr>
+          <w:rFonts w:eastAsia="Garamond"/>
+          <w:b/>
+          <w:color w:val="2E74B5"/>
+          <w:sz w:val="28"/>
+          <w:szCs w:val="28"/>
+        </w:rPr>
+      </w:pPr>
+      <w:r>
+        <w:rPr>
+          <w:rFonts w:eastAsia="Garamond"/>
+          <w:b/>
+          <w:color w:val="2E74B5"/>
+          <w:sz w:val="28"/>
+          <w:szCs w:val="28"/>
+        </w:rPr>
+        <w:lastRenderedPageBreak/>
+        <w:t>What I expect from you:</w:t>
+      </w:r>
+    </w:p>
+    <w:p>
+      <w:pPr>
+        <w:pBdr>
+          <w:top w:val="nil"/>
+          <w:left w:val="nil"/>
+          <w:bottom w:val="nil"/>
+          <w:right w:val="nil"/>
+          <w:between w:val="nil"/>
+        </w:pBdr>
+        <w:rPr>
+          <w:rFonts w:eastAsia="Garamond"/>
+          <w:b/>
+          <w:color w:val="2E74B5"/>
+          <w:sz w:val="20"/>
+          <w:szCs w:val="20"/>
+        </w:rPr>
+      </w:pPr>
+    </w:p>
+    <w:p>
+      <w:pPr>
+        <w:pBdr>
+          <w:top w:val="nil"/>
+          <w:left w:val="nil"/>
+          <w:bottom w:val="nil"/>
+          <w:right w:val="nil"/>
+          <w:between w:val="nil"/>
+        </w:pBdr>
+        <w:rPr>
+          <w:rFonts w:eastAsia="Garamond"/>
+          <w:b/>
+          <w:color w:val="2E74B5"/>
+          <w:sz w:val="28"/>
+          <w:szCs w:val="28"/>
+        </w:rPr>
+      </w:pPr>
+      <w:r>
+        <w:rPr>
+          <w:rFonts w:eastAsia="Garamond"/>
+          <w:b/>
+          <w:color w:val="2E74B5"/>
+          <w:sz w:val="28"/>
+          <w:szCs w:val="28"/>
+        </w:rPr>
+        <w:t>Coursework and Expectations:</w:t>
+      </w:r>
+    </w:p>
+    <w:p>
+      <w:pPr>
+        <w:pBdr>
+          <w:top w:val="nil"/>
+          <w:left w:val="nil"/>
+          <w:bottom w:val="nil"/>
+          <w:right w:val="nil"/>
+          <w:between w:val="nil"/>
+        </w:pBdr>
+        <w:rPr>
+          <w:rFonts w:eastAsia="Garamond"/>
+          <w:b/>
+          <w:color w:val="2E74B5"/>
+          <w:sz w:val="20"/>
+          <w:szCs w:val="28"/>
+        </w:rPr>
+      </w:pPr>
+    </w:p>
+    <w:p>
+      <w:pPr>
+        <w:pBdr>
+          <w:top w:val="nil"/>
+          <w:left w:val="nil"/>
+          <w:bottom w:val="nil"/>
+          <w:right w:val="nil"/>
+          <w:between w:val="nil"/>
+        </w:pBdr>
+        <w:rPr>
+          <w:rFonts w:eastAsia="Garamond"/>
+          <w:b/>
+          <w:color w:val="2E74B5"/>
+          <w:sz w:val="28"/>
+          <w:szCs w:val="28"/>
+        </w:rPr>
+      </w:pPr>
+      <w:r>
+        <w:rPr>
+          <w:rFonts w:eastAsia="Garamond"/>
+          <w:b/>
+        </w:rPr>
+        <w:t>Assignments:</w:t>
+      </w:r>
+    </w:p>
+    <w:p>
+      <w:pPr>
+        <w:pStyle w:val="ListParagraph"/>
+        <w:ind w:left="1080"/>
+        <w:rPr>
+          <w:rFonts w:eastAsia="Garamond" w:cs="Times New Roman"/>
+          <w:color w:val="00000A"/>
+          <w:sz w:val="16"/>
+          <w:szCs w:val="16"/>
+        </w:rPr>
+      </w:pPr>
+    </w:p>
+    <w:p>
+      <w:pPr>
+        <w:pStyle w:val="ListParagraph"/>
+        <w:numPr>
+          <w:ilvl w:val="0"/>
+          <w:numId w:val="11"/>
+        </w:numPr>
+        <w:rPr>
+          <w:rFonts w:eastAsia="Garamond" w:cs="Times New Roman"/>
+          <w:color w:val="00000A"/>
+        </w:rPr>
+      </w:pPr>
+      <w:r>
+        <w:rPr>
+          <w:rFonts w:eastAsia="Garamond" w:cs="Times New Roman"/>
+          <w:color w:val="00000A"/>
+        </w:rPr>
+        <w:t>You are expected to attend all class periods, participate in discussions, and ask questions if/when necessary.</w:t>
+      </w:r>
+      <w:r>
+        <w:rPr>
+          <w:rFonts w:eastAsia="Garamond" w:cs="Times New Roman"/>
+          <w:color w:val="00000A"/>
+        </w:rPr>
+        <w:t xml:space="preserve"> </w:t>
+      </w:r>
+    </w:p>
+    <w:p>
+      <w:pPr>
+        <w:pStyle w:val="ListParagraph"/>
+        <w:rPr>
+          <w:rFonts w:eastAsia="Garamond" w:cs="Times New Roman"/>
+        </w:rPr>
+      </w:pPr>
+    </w:p>
+    <w:p>
+      <w:pPr>
+        <w:pStyle w:val="ListParagraph"/>
+        <w:numPr>
+          <w:ilvl w:val="0"/>
+          <w:numId w:val="11"/>
+        </w:numPr>
+        <w:rPr>
+          <w:rFonts w:eastAsia="Garamond" w:cs="Times New Roman"/>
+        </w:rPr>
+      </w:pPr>
+      <w:r>
+        <w:rPr>
+          <w:rFonts w:eastAsia="Garamond" w:cs="Times New Roman"/>
+        </w:rPr>
+        <w:t xml:space="preserve">Homework and </w:t>
+      </w:r>
+      <w:r>
+        <w:rPr>
+          <w:rFonts w:eastAsia="Garamond" w:cs="Times New Roman"/>
+        </w:rPr>
+        <w:t>Problems</w:t>
+      </w:r>
+      <w:r>
+        <w:rPr>
+          <w:rFonts w:eastAsia="Garamond" w:cs="Times New Roman"/>
+        </w:rPr>
+        <w:t xml:space="preserve">: There will be </w:t>
+      </w:r>
+      <w:r>
+        <w:rPr>
+          <w:rFonts w:eastAsia="Garamond" w:cs="Times New Roman"/>
+        </w:rPr>
+        <w:t>H</w:t>
+      </w:r>
+      <w:r>
+        <w:rPr>
+          <w:rFonts w:eastAsia="Garamond" w:cs="Times New Roman"/>
+        </w:rPr>
+        <w:t>omework assignment</w:t>
+      </w:r>
+      <w:r>
+        <w:rPr>
+          <w:rFonts w:eastAsia="Garamond" w:cs="Times New Roman"/>
+        </w:rPr>
+        <w:t>s</w:t>
+      </w:r>
+      <w:r>
+        <w:rPr>
+          <w:rFonts w:eastAsia="Garamond" w:cs="Times New Roman"/>
+        </w:rPr>
+        <w:t xml:space="preserve"> and </w:t>
+      </w:r>
+      <w:r>
+        <w:rPr>
+          <w:rFonts w:eastAsia="Garamond" w:cs="Times New Roman"/>
+        </w:rPr>
+        <w:t>Problem Sets</w:t>
+      </w:r>
+      <w:r>
+        <w:rPr>
+          <w:rFonts w:eastAsia="Garamond" w:cs="Times New Roman"/>
+        </w:rPr>
+        <w:t xml:space="preserve"> throughout the semester</w:t>
+      </w:r>
+      <w:r>
+        <w:rPr>
+          <w:rFonts w:eastAsia="Garamond" w:cs="Times New Roman"/>
+        </w:rPr>
+        <w:t xml:space="preserve">. </w:t>
+      </w:r>
+      <w:r>
+        <w:rPr>
+          <w:rFonts w:eastAsia="Garamond" w:cs="Times New Roman"/>
+        </w:rPr>
+        <w:t>H</w:t>
+      </w:r>
+      <w:r>
+        <w:rPr>
+          <w:rFonts w:eastAsia="Garamond" w:cs="Times New Roman"/>
+        </w:rPr>
+        <w:t xml:space="preserve">omework </w:t>
+      </w:r>
+      <w:r>
+        <w:rPr>
+          <w:rFonts w:eastAsia="Garamond" w:cs="Times New Roman"/>
+        </w:rPr>
+        <w:t xml:space="preserve">and </w:t>
+      </w:r>
+      <w:r>
+        <w:rPr>
+          <w:rFonts w:eastAsia="Garamond" w:cs="Times New Roman"/>
+        </w:rPr>
+        <w:t>Problem Sets</w:t>
+      </w:r>
+      <w:r>
+        <w:rPr>
+          <w:rFonts w:eastAsia="Garamond" w:cs="Times New Roman"/>
+        </w:rPr>
+        <w:t xml:space="preserve"> will either be assigned in class or posted on Canvas</w:t>
+      </w:r>
+      <w:r>
+        <w:rPr>
+          <w:rFonts w:eastAsia="Garamond" w:cs="Times New Roman"/>
+        </w:rPr>
+        <w:t xml:space="preserve">. All homework assignments </w:t>
+      </w:r>
+      <w:r>
+        <w:rPr>
+          <w:rFonts w:eastAsia="Garamond" w:cs="Times New Roman"/>
+        </w:rPr>
+        <w:t xml:space="preserve">(both) </w:t>
+      </w:r>
+      <w:r>
+        <w:rPr>
+          <w:rFonts w:eastAsia="Garamond" w:cs="Times New Roman"/>
+        </w:rPr>
+        <w:t xml:space="preserve">may be completed in groups. I fully expect (and encourage) you to work together. </w:t>
+      </w:r>
+      <w:r>
+        <w:rPr>
+          <w:rFonts w:eastAsia="Garamond" w:cs="Times New Roman"/>
+        </w:rPr>
+        <w:t>However, remember that the tests will be done independently in class. So do not just copy other students work.</w:t>
+      </w:r>
+    </w:p>
+    <w:p>
+      <w:pPr>
+        <w:pStyle w:val="ListParagraph"/>
+        <w:rPr>
+          <w:rFonts w:eastAsia="Garamond" w:cs="Times New Roman"/>
+        </w:rPr>
+      </w:pPr>
+    </w:p>
+    <w:p>
+      <w:pPr>
+        <w:pStyle w:val="ListParagraph"/>
+        <w:numPr>
+          <w:ilvl w:val="0"/>
+          <w:numId w:val="11"/>
+        </w:numPr>
+        <w:rPr>
+          <w:rFonts w:eastAsia="Garamond" w:cs="Times New Roman"/>
+        </w:rPr>
+      </w:pPr>
+      <w:r>
+        <w:rPr>
+          <w:rFonts w:eastAsia="Garamond" w:cs="Times New Roman"/>
+        </w:rPr>
+        <w:t>You may use a computer to do any of your homework. But you need to make sure that you can complete the work on your calculator as well. For exams, you will only have access to your calculator.</w:t>
+      </w:r>
+    </w:p>
+    <w:p>
+      <w:pPr>
+        <w:pBdr>
+          <w:top w:val="nil"/>
+          <w:left w:val="nil"/>
+          <w:bottom w:val="nil"/>
+          <w:right w:val="nil"/>
+          <w:between w:val="nil"/>
+        </w:pBdr>
+        <w:ind w:firstLine="720"/>
+        <w:rPr>
+          <w:rFonts w:eastAsia="Garamond"/>
+          <w:color w:val="00000A"/>
+        </w:rPr>
+      </w:pPr>
+    </w:p>
+    <w:p>
+      <w:pPr>
+        <w:pStyle w:val="ListParagraph"/>
+        <w:numPr>
+          <w:ilvl w:val="0"/>
+          <w:numId w:val="11"/>
+        </w:numPr>
+        <w:pBdr>
+          <w:top w:val="nil"/>
+          <w:left w:val="nil"/>
+          <w:bottom w:val="nil"/>
+          <w:right w:val="nil"/>
+          <w:between w:val="nil"/>
+        </w:pBdr>
+        <w:rPr>
+          <w:rFonts w:eastAsia="Garamond"/>
+          <w:color w:val="00000A"/>
+        </w:rPr>
+      </w:pPr>
+      <w:r>
+        <w:rPr>
+          <w:rFonts w:eastAsia="Garamond"/>
+          <w:color w:val="00000A"/>
+        </w:rPr>
+        <w:t>Most homework assignments are based on completion and showing an effort to work the problems. Therefore, generally, they will only be worth about 5 points. Any late assignments will lose points depending on how late they are submitted.</w:t>
+      </w:r>
+    </w:p>
+    <w:p>
+      <w:pPr>
+        <w:pBdr>
+          <w:top w:val="nil"/>
+          <w:left w:val="nil"/>
+          <w:bottom w:val="nil"/>
+          <w:right w:val="nil"/>
+          <w:between w:val="nil"/>
+        </w:pBdr>
+        <w:ind w:firstLine="720"/>
+        <w:rPr>
+          <w:rFonts w:eastAsia="Garamond"/>
+          <w:color w:val="00000A"/>
+        </w:rPr>
+      </w:pPr>
+    </w:p>
+    <w:p>
+      <w:pPr>
+        <w:pBdr>
+          <w:top w:val="nil"/>
+          <w:left w:val="nil"/>
+          <w:bottom w:val="nil"/>
+          <w:right w:val="nil"/>
+          <w:between w:val="nil"/>
+        </w:pBdr>
+        <w:ind w:firstLine="720"/>
+        <w:rPr>
+          <w:rFonts w:eastAsia="Garamond"/>
+          <w:b/>
+          <w:bCs/>
+          <w:color w:val="00000A"/>
+        </w:rPr>
+      </w:pPr>
+      <w:r>
+        <w:rPr>
+          <w:rFonts w:eastAsia="Garamond"/>
+          <w:b/>
+          <w:bCs/>
+          <w:color w:val="00000A"/>
+        </w:rPr>
+        <w:t>***Other assignments may be added as needed. ***</w:t>
+      </w:r>
+    </w:p>
+    <w:p>
+      <w:pPr>
+        <w:pBdr>
+          <w:top w:val="nil"/>
+          <w:left w:val="nil"/>
+          <w:bottom w:val="nil"/>
+          <w:right w:val="nil"/>
+          <w:between w:val="nil"/>
+        </w:pBdr>
+        <w:ind w:firstLine="720"/>
+        <w:rPr>
+          <w:rFonts w:eastAsia="Garamond"/>
+          <w:b/>
+          <w:bCs/>
+          <w:color w:val="00000A"/>
+        </w:rPr>
+      </w:pPr>
+    </w:p>
+    <w:p>
+      <w:pPr>
+        <w:pBdr>
+          <w:top w:val="nil"/>
+          <w:left w:val="nil"/>
+          <w:bottom w:val="nil"/>
+          <w:right w:val="nil"/>
+          <w:between w:val="nil"/>
+        </w:pBdr>
+        <w:ind w:firstLine="720"/>
+        <w:rPr>
+          <w:rFonts w:eastAsia="Garamond"/>
+          <w:b/>
+          <w:bCs/>
+          <w:color w:val="00000A"/>
+        </w:rPr>
+      </w:pPr>
+      <w:r>
+        <w:rPr>
+          <w:rFonts w:eastAsia="Garamond"/>
+          <w:color w:val="00000A"/>
+        </w:rPr>
+        <w:t>Testing procedures: The course will have three exams that will cover a selection of the material. Additionally, the course will conclude with</w:t>
+      </w:r>
+      <w:r>
+        <w:rPr>
+          <w:rFonts w:eastAsia="Garamond"/>
+          <w:b/>
+          <w:bCs/>
+          <w:color w:val="00000A"/>
+        </w:rPr>
+        <w:t xml:space="preserve"> </w:t>
+      </w:r>
+      <w:r>
+        <w:rPr>
+          <w:rFonts w:eastAsia="Garamond"/>
+          <w:color w:val="00000A"/>
+        </w:rPr>
+        <w:t>a final exam that will cover a portion of new material as well as a portion of the material previously covered in the earlier exams</w:t>
+      </w:r>
+      <w:r>
+        <w:rPr>
+          <w:rFonts w:eastAsia="Garamond"/>
+          <w:color w:val="00000A"/>
+        </w:rPr>
+        <w:t xml:space="preserve"> (comprehensive)</w:t>
+      </w:r>
+      <w:r>
+        <w:rPr>
+          <w:rFonts w:eastAsia="Garamond"/>
+          <w:color w:val="00000A"/>
+        </w:rPr>
+        <w:t xml:space="preserve">. All examinations will occur in class and on paper. </w:t>
+      </w:r>
+      <w:r>
+        <w:rPr>
+          <w:rFonts w:eastAsia="Garamond"/>
+          <w:b/>
+          <w:bCs/>
+          <w:color w:val="00000A"/>
+        </w:rPr>
+        <w:t>(You may use a 4x6 inch notecard for your exam</w:t>
+      </w:r>
+      <w:r>
+        <w:rPr>
+          <w:rFonts w:eastAsia="Garamond"/>
+          <w:b/>
+          <w:bCs/>
+          <w:color w:val="00000A"/>
+        </w:rPr>
+        <w:t>.)</w:t>
+      </w:r>
+    </w:p>
+    <w:p>
+      <w:pPr>
+        <w:pBdr>
+          <w:top w:val="nil"/>
+          <w:left w:val="nil"/>
+          <w:bottom w:val="nil"/>
+          <w:right w:val="nil"/>
+          <w:between w:val="nil"/>
+        </w:pBdr>
+        <w:ind w:firstLine="720"/>
+        <w:rPr>
+          <w:rFonts w:eastAsia="Garamond"/>
+          <w:color w:val="00000A"/>
+        </w:rPr>
+      </w:pPr>
+    </w:p>
+    <w:p>
+      <w:pPr>
+        <w:pBdr>
+          <w:top w:val="nil"/>
+          <w:left w:val="nil"/>
+          <w:bottom w:val="nil"/>
+          <w:right w:val="nil"/>
+          <w:between w:val="nil"/>
+        </w:pBdr>
+        <w:ind w:firstLine="720"/>
+        <w:rPr>
+          <w:rFonts w:eastAsia="Garamond"/>
+          <w:color w:val="00000A"/>
+        </w:rPr>
+      </w:pPr>
+      <w:r>
+        <w:rPr>
+          <w:rFonts w:eastAsia="Garamond"/>
+          <w:color w:val="00000A"/>
+        </w:rPr>
+        <w:t xml:space="preserve">Timing of the exams: I am planning for our exams to occur approximately every four weeks. However, these </w:t>
+      </w:r>
+      <w:r>
+        <w:rPr>
+          <w:rFonts w:eastAsia="Garamond"/>
+          <w:color w:val="00000A"/>
+        </w:rPr>
+        <w:t>times</w:t>
+      </w:r>
+      <w:r>
+        <w:rPr>
+          <w:rFonts w:eastAsia="Garamond"/>
+          <w:color w:val="00000A"/>
+        </w:rPr>
+        <w:t xml:space="preserve"> are not written in </w:t>
+      </w:r>
+      <w:r>
+        <w:rPr>
+          <w:rFonts w:eastAsia="Garamond"/>
+          <w:color w:val="00000A"/>
+        </w:rPr>
+        <w:t>stone</w:t>
+      </w:r>
+      <w:r>
+        <w:rPr>
+          <w:rFonts w:eastAsia="Garamond"/>
+          <w:color w:val="00000A"/>
+        </w:rPr>
+        <w:t xml:space="preserve">. </w:t>
+      </w:r>
+      <w:r>
+        <w:rPr>
+          <w:rFonts w:eastAsia="Garamond"/>
+          <w:color w:val="00000A"/>
+        </w:rPr>
+        <w:t>They will occur when we have covered the appropriate material.</w:t>
+      </w:r>
+      <w:r>
+        <w:rPr>
+          <w:rFonts w:eastAsia="Garamond"/>
+          <w:color w:val="00000A"/>
+        </w:rPr>
+        <w:t xml:space="preserve"> We will discuss timing of the exams in class.</w:t>
+      </w:r>
+    </w:p>
+    <w:p>
+      <w:pPr>
+        <w:pBdr>
+          <w:top w:val="nil"/>
+          <w:left w:val="nil"/>
+          <w:bottom w:val="nil"/>
+          <w:right w:val="nil"/>
+          <w:between w:val="nil"/>
+        </w:pBdr>
+        <w:ind w:firstLine="720"/>
+        <w:rPr>
+          <w:rFonts w:eastAsia="Garamond"/>
+          <w:color w:val="00000A"/>
+        </w:rPr>
+      </w:pPr>
+    </w:p>
+    <w:p>
+      <w:pPr>
+        <w:pBdr>
+          <w:top w:val="nil"/>
+          <w:left w:val="nil"/>
+          <w:bottom w:val="nil"/>
+          <w:right w:val="nil"/>
+          <w:between w:val="nil"/>
+        </w:pBdr>
+        <w:rPr>
+          <w:rFonts w:eastAsia="Garamond"/>
+          <w:bCs/>
+          <w:color w:val="000000" w:themeColor="text1"/>
+        </w:rPr>
+      </w:pPr>
+      <w:r>
+        <w:rPr>
+          <w:rFonts w:eastAsia="Garamond"/>
+          <w:b/>
+          <w:color w:val="000000" w:themeColor="text1"/>
+        </w:rPr>
+        <w:t xml:space="preserve">Office hours - </w:t>
+      </w:r>
+      <w:r>
+        <w:rPr>
+          <w:rFonts w:eastAsia="Garamond"/>
+          <w:bCs/>
+          <w:color w:val="000000" w:themeColor="text1"/>
+        </w:rPr>
+        <w:t>I will maintain office hours posted outside my office. This time is an extension of our class time. This time is reserved for you should you need to talk with me</w:t>
+      </w:r>
+      <w:r>
+        <w:rPr>
+          <w:rFonts w:eastAsia="Garamond"/>
+          <w:bCs/>
+          <w:color w:val="000000" w:themeColor="text1"/>
+        </w:rPr>
+        <w:t xml:space="preserve"> about class</w:t>
+      </w:r>
+      <w:r>
+        <w:rPr>
+          <w:rFonts w:eastAsia="Garamond"/>
+          <w:bCs/>
+          <w:color w:val="000000" w:themeColor="text1"/>
+        </w:rPr>
+        <w:t>. If those times do not work for you, or something should arise outside of class or office hours, you may email me to schedule another meeting time. Please plan accordingly.</w:t>
+      </w:r>
+    </w:p>
+    <w:p>
+      <w:pPr>
+        <w:pBdr>
+          <w:top w:val="nil"/>
+          <w:left w:val="nil"/>
+          <w:bottom w:val="nil"/>
+          <w:right w:val="nil"/>
+          <w:between w:val="nil"/>
+        </w:pBdr>
+        <w:rPr>
+          <w:rFonts w:eastAsia="Garamond"/>
+          <w:bCs/>
+          <w:color w:val="000000" w:themeColor="text1"/>
+        </w:rPr>
+      </w:pPr>
+    </w:p>
+    <w:p>
+      <w:r>
+        <w:rPr>
+          <w:b/>
+          <w:bCs/>
+        </w:rPr>
+        <w:t xml:space="preserve">Phones and laptops in class – </w:t>
+      </w:r>
+      <w:r>
+        <w:t xml:space="preserve">There will be no phone usage </w:t>
+      </w:r>
+      <w:r>
+        <w:t xml:space="preserve">in </w:t>
+      </w:r>
+      <w:r>
+        <w:t>class. Computer usage should be limited to course material during class. If you have a question regarding a homework or quiz question, you may discuss it with me after class or during office hours.</w:t>
+      </w:r>
+    </w:p>
+    <w:p>
+      <w:pPr>
+        <w:rPr>
+          <w:rFonts w:eastAsia="Garamond"/>
+          <w:b/>
+          <w:color w:val="2E74B5"/>
+          <w:sz w:val="28"/>
+          <w:szCs w:val="28"/>
+        </w:rPr>
+      </w:pPr>
+      <w:r>
+        <w:rPr>
+          <w:rFonts w:eastAsia="Garamond"/>
+          <w:b/>
+          <w:color w:val="2E74B5"/>
+          <w:sz w:val="28"/>
+          <w:szCs w:val="28"/>
+        </w:rPr>
+        <w:br w:type="page"/>
+      </w:r>
+    </w:p>
+    <w:p>
+      <w:pPr>
+        <w:pBdr>
+          <w:top w:val="nil"/>
+          <w:left w:val="nil"/>
+          <w:bottom w:val="nil"/>
+          <w:right w:val="nil"/>
+          <w:between w:val="nil"/>
+        </w:pBdr>
+        <w:rPr>
+          <w:rFonts w:eastAsia="Garamond"/>
+          <w:b/>
           <w:color w:val="4F81BD" w:themeColor="accent1"/>
           <w:sz w:val="28"/>
           <w:szCs w:val="28"/>
@@ -3862,6 +4192,7 @@
           <w:sz w:val="28"/>
           <w:szCs w:val="28"/>
         </w:rPr>
+        <w:lastRenderedPageBreak/>
         <w:t>Conduct</w:t>
       </w:r>
       <w:r>
@@ -6859,6 +7190,18 @@
       <w:lang w:bidi="ar-SA"/>
     </w:rPr>
   </w:style>
+  <w:style w:type="paragraph" w:customStyle="1" w:styleId="p1">
+    <w:name w:val="p1"/>
+    <w:basedOn w:val="Normal"/>
+    <w:rsid w:val="00C71F00"/>
+    <w:pPr>
+      <w:widowControl/>
+      <w:spacing w:before="100" w:beforeAutospacing="1" w:after="100" w:afterAutospacing="1"/>
+    </w:pPr>
+    <w:rPr>
+      <w:lang w:bidi="ar-SA"/>
+    </w:rPr>
+  </w:style>
 </w:styles>
 </file>
 

</xml_diff>